<commit_message>
Agregando carpeta FASE 2
</commit_message>
<xml_diff>
--- a/Fase 1/Evidencias Grupales/1.5_GuiaEstudiante_Fase 1_Definicion Proyecto APT.docx
+++ b/Fase 1/Evidencias Grupales/1.5_GuiaEstudiante_Fase 1_Definicion Proyecto APT.docx
@@ -560,21 +560,7 @@
               <w:rPr>
                 <w:b/>
               </w:rPr>
-              <w:t xml:space="preserve">Nicolas Caviedes, Sergio Plaza, Yohan Cortez, </w:t>
-            </w:r>
-            <w:proofErr w:type="spellStart"/>
-            <w:r>
-              <w:rPr>
-                <w:b/>
-              </w:rPr>
-              <w:t>Nestor</w:t>
-            </w:r>
-            <w:proofErr w:type="spellEnd"/>
-            <w:r>
-              <w:rPr>
-                <w:b/>
-              </w:rPr>
-              <w:t xml:space="preserve"> Barrera</w:t>
+              <w:t>Nicolas Caviedes, Sergio Plaza, Yohan Cortez, Nestor Barrera</w:t>
             </w:r>
           </w:p>
         </w:tc>
@@ -620,6 +606,12 @@
                 <w:b/>
               </w:rPr>
               <w:t>21.020.117-3, 18.783.391-4,</w:t>
+            </w:r>
+            <w:r>
+              <w:rPr>
+                <w:b/>
+              </w:rPr>
+              <w:t xml:space="preserve"> 19.780.782-2, 17.994.020-5</w:t>
             </w:r>
           </w:p>
         </w:tc>
@@ -867,14 +859,12 @@
                 <w:b/>
               </w:rPr>
             </w:pPr>
-            <w:proofErr w:type="spellStart"/>
             <w:r>
               <w:rPr>
                 <w:b/>
               </w:rPr>
               <w:t>Stockify</w:t>
             </w:r>
-            <w:proofErr w:type="spellEnd"/>
           </w:p>
         </w:tc>
       </w:tr>
@@ -1034,23 +1024,7 @@
                 <w:b/>
                 <w:bCs/>
               </w:rPr>
-              <w:t>Modelamiento y gestión de datos: calidad de datos y ETL/ELT desde diversas fuentes (</w:t>
-            </w:r>
-            <w:proofErr w:type="spellStart"/>
-            <w:r>
-              <w:rPr>
-                <w:b/>
-                <w:bCs/>
-              </w:rPr>
-              <w:t>APIs</w:t>
-            </w:r>
-            <w:proofErr w:type="spellEnd"/>
-            <w:r>
-              <w:rPr>
-                <w:b/>
-                <w:bCs/>
-              </w:rPr>
-              <w:t>, archivos/planillas).</w:t>
+              <w:t>Modelamiento y gestión de datos: calidad de datos y ETL/ELT desde diversas fuentes (APIs, archivos/planillas).</w:t>
             </w:r>
           </w:p>
           <w:p>
@@ -1118,23 +1092,7 @@
                 <w:b/>
                 <w:bCs/>
               </w:rPr>
-              <w:t>Desarrollo y validación de un MVP con buenas prácticas (versionado, pruebas, documentación) y visualización de resultados (</w:t>
-            </w:r>
-            <w:proofErr w:type="spellStart"/>
-            <w:r>
-              <w:rPr>
-                <w:b/>
-                <w:bCs/>
-              </w:rPr>
-              <w:t>dashboard</w:t>
-            </w:r>
-            <w:proofErr w:type="spellEnd"/>
-            <w:r>
-              <w:rPr>
-                <w:b/>
-                <w:bCs/>
-              </w:rPr>
-              <w:t>/alertas).</w:t>
+              <w:t>Desarrollo y validación de un MVP con buenas prácticas (versionado, pruebas, documentación) y visualización de resultados (dashboard/alertas).</w:t>
             </w:r>
           </w:p>
           <w:p>
@@ -1357,35 +1315,7 @@
               <w:rPr>
                 <w:bCs/>
               </w:rPr>
-              <w:t xml:space="preserve">En el sector gastronómico y de entretenimiento nocturno (p. ej., discotecas, bares y restobares) la gestión de inventario suele ser manual y fragmentada, lo que genera quiebres, </w:t>
-            </w:r>
-            <w:proofErr w:type="spellStart"/>
-            <w:r>
-              <w:rPr>
-                <w:bCs/>
-              </w:rPr>
-              <w:t>sobrestock</w:t>
-            </w:r>
-            <w:proofErr w:type="spellEnd"/>
-            <w:r>
-              <w:rPr>
-                <w:bCs/>
-              </w:rPr>
-              <w:t xml:space="preserve"> y mermas. Además, la demanda es altamente variable (eventos, temporada, clima), y las decisiones de reposición se toman de forma reactiva. </w:t>
-            </w:r>
-            <w:proofErr w:type="spellStart"/>
-            <w:r>
-              <w:rPr>
-                <w:bCs/>
-              </w:rPr>
-              <w:t>Stockify</w:t>
-            </w:r>
-            <w:proofErr w:type="spellEnd"/>
-            <w:r>
-              <w:rPr>
-                <w:bCs/>
-              </w:rPr>
-              <w:t xml:space="preserve"> aborda este problema centralizando datos operacionales y anticipando el consumo para mejorar continuidad de servicio y margen.</w:t>
+              <w:t>En el sector gastronómico y de entretenimiento nocturno (p. ej., discotecas, bares y restobares) la gestión de inventario suele ser manual y fragmentada, lo que genera quiebres, sobrestock y mermas. Además, la demanda es altamente variable (eventos, temporada, clima), y las decisiones de reposición se toman de forma reactiva. Stockify aborda este problema centralizando datos operacionales y anticipando el consumo para mejorar continuidad de servicio y margen.</w:t>
             </w:r>
           </w:p>
           <w:p>
@@ -1436,15 +1366,7 @@
               <w:jc w:val="both"/>
             </w:pPr>
             <w:r>
-              <w:t xml:space="preserve">Capta y consolida datos operacionales (ventas, movimientos, mermas) desde fuentes existentes (exportaciones de POS/planillas, </w:t>
-            </w:r>
-            <w:proofErr w:type="spellStart"/>
-            <w:r>
-              <w:t>APIs</w:t>
-            </w:r>
-            <w:proofErr w:type="spellEnd"/>
-            <w:r>
-              <w:t xml:space="preserve"> cuando existan).</w:t>
+              <w:t>Capta y consolida datos operacionales (ventas, movimientos, mermas) desde fuentes existentes (exportaciones de POS/planillas, APIs cuando existan).</w:t>
             </w:r>
           </w:p>
           <w:p>
@@ -1483,15 +1405,7 @@
               <w:jc w:val="both"/>
             </w:pPr>
             <w:r>
-              <w:t xml:space="preserve">Entrega un </w:t>
-            </w:r>
-            <w:proofErr w:type="spellStart"/>
-            <w:r>
-              <w:t>dashboard</w:t>
-            </w:r>
-            <w:proofErr w:type="spellEnd"/>
-            <w:r>
-              <w:t xml:space="preserve"> operativo para decisiones diarias y revisión por local/sucursal.</w:t>
+              <w:t>Entrega un dashboard operativo para decisiones diarias y revisión por local/sucursal.</w:t>
             </w:r>
           </w:p>
           <w:p>
@@ -1522,15 +1436,7 @@
               <w:jc w:val="both"/>
             </w:pPr>
             <w:r>
-              <w:t xml:space="preserve">Alineado con el interés en </w:t>
-            </w:r>
-            <w:proofErr w:type="spellStart"/>
-            <w:r>
-              <w:t>backend</w:t>
-            </w:r>
-            <w:proofErr w:type="spellEnd"/>
-            <w:r>
-              <w:t xml:space="preserve">/data y construcción de productos B2B: integra diseño de servicios, analítica aplicada y despliegue de un MVP </w:t>
+              <w:t xml:space="preserve">Alineado con el interés en backend/data y construcción de productos B2B: integra diseño de servicios, analítica aplicada y despliegue de un MVP </w:t>
             </w:r>
             <w:r>
               <w:lastRenderedPageBreak/>
@@ -1553,31 +1459,7 @@
             </w:r>
             <w:r>
               <w:br/>
-              <w:t xml:space="preserve">Abordable en un semestre con dedicación semanal de la asignatura. Requiere un entorno de desarrollo estándar, servicios </w:t>
-            </w:r>
-            <w:proofErr w:type="spellStart"/>
-            <w:r>
-              <w:t>cloud</w:t>
-            </w:r>
-            <w:proofErr w:type="spellEnd"/>
-            <w:r>
-              <w:t xml:space="preserve"> de nivel gratuito y </w:t>
-            </w:r>
-            <w:proofErr w:type="spellStart"/>
-            <w:r>
-              <w:t>datasets</w:t>
-            </w:r>
-            <w:proofErr w:type="spellEnd"/>
-            <w:r>
-              <w:t xml:space="preserve"> iniciales (histórico de ventas/consumo; si no existen, se generan </w:t>
-            </w:r>
-            <w:proofErr w:type="spellStart"/>
-            <w:r>
-              <w:t>datasets</w:t>
-            </w:r>
-            <w:proofErr w:type="spellEnd"/>
-            <w:r>
-              <w:t xml:space="preserve"> sintéticos coherentes). Riesgos: </w:t>
+              <w:t xml:space="preserve">Abordable en un semestre con dedicación semanal de la asignatura. Requiere un entorno de desarrollo estándar, servicios cloud de nivel gratuito y datasets iniciales (histórico de ventas/consumo; si no existen, se generan datasets sintéticos coherentes). Riesgos: </w:t>
             </w:r>
             <w:r>
               <w:rPr>
@@ -1731,7 +1613,6 @@
             <w:r>
               <w:t xml:space="preserve"> o </w:t>
             </w:r>
-            <w:proofErr w:type="spellStart"/>
             <w:r>
               <w:rPr>
                 <w:b/>
@@ -1739,7 +1620,6 @@
               </w:rPr>
               <w:t>APIs</w:t>
             </w:r>
-            <w:proofErr w:type="spellEnd"/>
             <w:r>
               <w:t xml:space="preserve"> cuando existan, los </w:t>
             </w:r>
@@ -1753,26 +1633,16 @@
             <w:r>
               <w:t xml:space="preserve">, calculará </w:t>
             </w:r>
-            <w:proofErr w:type="spellStart"/>
-            <w:r>
-              <w:rPr>
-                <w:b/>
-                <w:bCs/>
-              </w:rPr>
-              <w:t>KPIs</w:t>
-            </w:r>
-            <w:proofErr w:type="spellEnd"/>
-            <w:r>
-              <w:rPr>
-                <w:b/>
-                <w:bCs/>
-              </w:rPr>
-              <w:t xml:space="preserve"> clave</w:t>
+            <w:r>
+              <w:rPr>
+                <w:b/>
+                <w:bCs/>
+              </w:rPr>
+              <w:t>KPIs clave</w:t>
             </w:r>
             <w:r>
               <w:t xml:space="preserve"> (rotación, cobertura, quiebres y diferencia entre venta esperada y real) y mostrará la información en un </w:t>
             </w:r>
-            <w:proofErr w:type="spellStart"/>
             <w:r>
               <w:rPr>
                 <w:b/>
@@ -1780,7 +1650,6 @@
               </w:rPr>
               <w:t>dashboard</w:t>
             </w:r>
-            <w:proofErr w:type="spellEnd"/>
             <w:r>
               <w:t xml:space="preserve"> con </w:t>
             </w:r>
@@ -1847,17 +1716,8 @@
                 <w:b/>
                 <w:bCs/>
               </w:rPr>
-              <w:t xml:space="preserve">metodología ágil por </w:t>
-            </w:r>
-            <w:proofErr w:type="spellStart"/>
-            <w:r>
-              <w:rPr>
-                <w:b/>
-                <w:bCs/>
-              </w:rPr>
-              <w:t>sprints</w:t>
-            </w:r>
-            <w:proofErr w:type="spellEnd"/>
+              <w:t>metodología ágil por sprints</w:t>
+            </w:r>
             <w:r>
               <w:t xml:space="preserve">, construyendo incrementos funcionales y validándolos en un </w:t>
             </w:r>
@@ -1889,50 +1749,24 @@
               <w:t>Líder/Arquitectura &amp; Datos</w:t>
             </w:r>
             <w:r>
-              <w:t xml:space="preserve"> (modelo de datos, </w:t>
-            </w:r>
-            <w:proofErr w:type="spellStart"/>
-            <w:r>
-              <w:t>KPIs</w:t>
-            </w:r>
-            <w:proofErr w:type="spellEnd"/>
-            <w:r>
-              <w:t xml:space="preserve">, decisiones técnicas) y </w:t>
-            </w:r>
-            <w:r>
-              <w:rPr>
-                <w:b/>
-                <w:bCs/>
-              </w:rPr>
-              <w:t>dos desarrolladores full-</w:t>
-            </w:r>
-            <w:proofErr w:type="spellStart"/>
-            <w:r>
-              <w:rPr>
-                <w:b/>
-                <w:bCs/>
-              </w:rPr>
-              <w:t>stack</w:t>
-            </w:r>
-            <w:proofErr w:type="spellEnd"/>
+              <w:t xml:space="preserve"> (modelo de datos, KPIs, decisiones técnicas) y </w:t>
+            </w:r>
+            <w:r>
+              <w:rPr>
+                <w:b/>
+                <w:bCs/>
+              </w:rPr>
+              <w:t>dos desarrolladores full-stack</w:t>
+            </w:r>
             <w:r>
               <w:t xml:space="preserve"> (funcionalidades “de base de datos a pantalla”). Se prioriza partir sin integraciones en vivo (ingesta por exportaciones) y, si faltan históricos, se utilizarán </w:t>
             </w:r>
-            <w:proofErr w:type="spellStart"/>
-            <w:r>
-              <w:rPr>
-                <w:b/>
-                <w:bCs/>
-              </w:rPr>
-              <w:t>datasets</w:t>
-            </w:r>
-            <w:proofErr w:type="spellEnd"/>
-            <w:r>
-              <w:rPr>
-                <w:b/>
-                <w:bCs/>
-              </w:rPr>
-              <w:t xml:space="preserve"> sintéticos coherentes</w:t>
+            <w:r>
+              <w:rPr>
+                <w:b/>
+                <w:bCs/>
+              </w:rPr>
+              <w:t>datasets sintéticos coherentes</w:t>
             </w:r>
             <w:r>
               <w:t xml:space="preserve"> para pruebas. Se controlará </w:t>
@@ -2001,7 +1835,6 @@
             <w:pPr>
               <w:jc w:val="both"/>
             </w:pPr>
-            <w:proofErr w:type="spellStart"/>
             <w:r>
               <w:rPr>
                 <w:b/>
@@ -2009,7 +1842,6 @@
               </w:rPr>
               <w:t>Stockify</w:t>
             </w:r>
-            <w:proofErr w:type="spellEnd"/>
             <w:r>
               <w:t xml:space="preserve"> es pertinente al perfil de egreso de </w:t>
             </w:r>
@@ -2110,21 +1942,12 @@
             <w:r>
               <w:t xml:space="preserve"> definición de </w:t>
             </w:r>
-            <w:proofErr w:type="spellStart"/>
-            <w:r>
-              <w:rPr>
-                <w:b/>
-                <w:bCs/>
-              </w:rPr>
-              <w:t>KPIs</w:t>
-            </w:r>
-            <w:proofErr w:type="spellEnd"/>
-            <w:r>
-              <w:rPr>
-                <w:b/>
-                <w:bCs/>
-              </w:rPr>
-              <w:t xml:space="preserve"> operativos</w:t>
+            <w:r>
+              <w:rPr>
+                <w:b/>
+                <w:bCs/>
+              </w:rPr>
+              <w:t>KPIs operativos</w:t>
             </w:r>
             <w:r>
               <w:t xml:space="preserve"> (rotación, merma, quiebre, desvío esperado vs. real) y construcción de un </w:t>
@@ -2261,21 +2084,12 @@
             <w:r>
               <w:t xml:space="preserve">Como equipo, nuestro foco es </w:t>
             </w:r>
-            <w:proofErr w:type="spellStart"/>
-            <w:r>
-              <w:rPr>
-                <w:b/>
-                <w:bCs/>
-              </w:rPr>
-              <w:t>backend</w:t>
-            </w:r>
-            <w:proofErr w:type="spellEnd"/>
-            <w:r>
-              <w:rPr>
-                <w:b/>
-                <w:bCs/>
-              </w:rPr>
-              <w:t xml:space="preserve"> y datos</w:t>
+            <w:r>
+              <w:rPr>
+                <w:b/>
+                <w:bCs/>
+              </w:rPr>
+              <w:t>backend y datos</w:t>
             </w:r>
             <w:r>
               <w:t xml:space="preserve">, </w:t>
@@ -2295,21 +2109,11 @@
                 <w:b/>
                 <w:bCs/>
               </w:rPr>
-              <w:t xml:space="preserve">productos B2B para </w:t>
-            </w:r>
-            <w:proofErr w:type="spellStart"/>
-            <w:r>
-              <w:rPr>
-                <w:b/>
-                <w:bCs/>
-              </w:rPr>
-              <w:t>PYMEs</w:t>
-            </w:r>
-            <w:proofErr w:type="spellEnd"/>
+              <w:t>productos B2B para PYMEs</w:t>
+            </w:r>
             <w:r>
               <w:t xml:space="preserve">. </w:t>
             </w:r>
-            <w:proofErr w:type="spellStart"/>
             <w:r>
               <w:rPr>
                 <w:b/>
@@ -2317,7 +2121,6 @@
               </w:rPr>
               <w:t>Stockify</w:t>
             </w:r>
-            <w:proofErr w:type="spellEnd"/>
             <w:r>
               <w:t xml:space="preserve"> encaja porque nos exige construir un </w:t>
             </w:r>
@@ -2410,15 +2213,7 @@
               <w:t>Roles complementarios:</w:t>
             </w:r>
             <w:r>
-              <w:t xml:space="preserve"> </w:t>
-            </w:r>
-            <w:proofErr w:type="spellStart"/>
-            <w:r>
-              <w:t>backend</w:t>
-            </w:r>
-            <w:proofErr w:type="spellEnd"/>
-            <w:r>
-              <w:t>, modelado/ingesta de datos, analítica, QA/gestión.</w:t>
+              <w:t xml:space="preserve"> backend, modelado/ingesta de datos, analítica, QA/gestión.</w:t>
             </w:r>
           </w:p>
           <w:p>
@@ -2458,15 +2253,7 @@
               <w:t>Validación realista:</w:t>
             </w:r>
             <w:r>
-              <w:t xml:space="preserve"> piloto acotado y </w:t>
-            </w:r>
-            <w:proofErr w:type="spellStart"/>
-            <w:r>
-              <w:t>dashboard</w:t>
-            </w:r>
-            <w:proofErr w:type="spellEnd"/>
-            <w:r>
-              <w:t xml:space="preserve"> para decisiones diarias medibles.</w:t>
+              <w:t xml:space="preserve"> piloto acotado y dashboard para decisiones diarias medibles.</w:t>
             </w:r>
           </w:p>
         </w:tc>
@@ -2549,15 +2336,7 @@
               <w:t>calidad de datos</w:t>
             </w:r>
             <w:r>
-              <w:t xml:space="preserve"> (CSV/Excel/</w:t>
-            </w:r>
-            <w:proofErr w:type="spellStart"/>
-            <w:r>
-              <w:t>APIs</w:t>
-            </w:r>
-            <w:proofErr w:type="spellEnd"/>
-            <w:r>
-              <w:t xml:space="preserve"> cuando existan).</w:t>
+              <w:t xml:space="preserve"> (CSV/Excel/APIs cuando existan).</w:t>
             </w:r>
           </w:p>
           <w:p>
@@ -2599,13 +2378,8 @@
                 <w:numId w:val="12"/>
               </w:numPr>
             </w:pPr>
-            <w:proofErr w:type="spellStart"/>
-            <w:r>
-              <w:t>Dashboard</w:t>
-            </w:r>
-            <w:proofErr w:type="spellEnd"/>
-            <w:r>
-              <w:t xml:space="preserve">, alertas y validación con un </w:t>
+            <w:r>
+              <w:t xml:space="preserve">Dashboard, alertas y validación con un </w:t>
             </w:r>
             <w:r>
               <w:rPr>
@@ -2763,7 +2537,6 @@
                 <w:numId w:val="12"/>
               </w:numPr>
             </w:pPr>
-            <w:proofErr w:type="spellStart"/>
             <w:r>
               <w:rPr>
                 <w:b/>
@@ -2771,7 +2544,6 @@
               </w:rPr>
               <w:t>Dashboard</w:t>
             </w:r>
-            <w:proofErr w:type="spellEnd"/>
             <w:r>
               <w:t xml:space="preserve"> web/simple para visualización y alertas.</w:t>
             </w:r>
@@ -2872,15 +2644,7 @@
               <w:t>Equipo con roles complementarios</w:t>
             </w:r>
             <w:r>
-              <w:t xml:space="preserve"> (</w:t>
-            </w:r>
-            <w:proofErr w:type="spellStart"/>
-            <w:r>
-              <w:t>backend</w:t>
-            </w:r>
-            <w:proofErr w:type="spellEnd"/>
-            <w:r>
-              <w:t>/datos/analítica/QA).</w:t>
+              <w:t xml:space="preserve"> (backend/datos/analítica/QA).</w:t>
             </w:r>
           </w:p>
           <w:p>
@@ -2899,17 +2663,8 @@
                 <w:b/>
                 <w:bCs/>
               </w:rPr>
-              <w:t xml:space="preserve">top </w:t>
-            </w:r>
-            <w:proofErr w:type="spellStart"/>
-            <w:r>
-              <w:rPr>
-                <w:b/>
-                <w:bCs/>
-              </w:rPr>
-              <w:t>SKUs</w:t>
-            </w:r>
-            <w:proofErr w:type="spellEnd"/>
+              <w:t>top SKUs</w:t>
+            </w:r>
             <w:r>
               <w:t xml:space="preserve"> y </w:t>
             </w:r>
@@ -3008,23 +2763,7 @@
               <w:t>Alta variabilidad por eventos</w:t>
             </w:r>
             <w:r>
-              <w:t xml:space="preserve"> → marcar eventos (</w:t>
-            </w:r>
-            <w:proofErr w:type="spellStart"/>
-            <w:r>
-              <w:t>promos</w:t>
-            </w:r>
-            <w:proofErr w:type="spellEnd"/>
-            <w:r>
-              <w:t xml:space="preserve">/fechas especiales) en el </w:t>
-            </w:r>
-            <w:proofErr w:type="spellStart"/>
-            <w:r>
-              <w:t>dataset</w:t>
-            </w:r>
-            <w:proofErr w:type="spellEnd"/>
-            <w:r>
-              <w:t xml:space="preserve"> para ajustar el modelo.</w:t>
+              <w:t xml:space="preserve"> → marcar eventos (promos/fechas especiales) en el dataset para ajustar el modelo.</w:t>
             </w:r>
           </w:p>
           <w:p>
@@ -3045,7 +2784,6 @@
             <w:r>
               <w:t xml:space="preserve"> → </w:t>
             </w:r>
-            <w:proofErr w:type="spellStart"/>
             <w:r>
               <w:rPr>
                 <w:b/>
@@ -3053,7 +2791,6 @@
               </w:rPr>
               <w:t>timeboxing</w:t>
             </w:r>
-            <w:proofErr w:type="spellEnd"/>
             <w:r>
               <w:t>, priorización de entregables y demos quincenales.</w:t>
             </w:r>
@@ -3076,21 +2813,12 @@
             <w:r>
               <w:t xml:space="preserve"> → uso de </w:t>
             </w:r>
-            <w:proofErr w:type="spellStart"/>
-            <w:r>
-              <w:rPr>
-                <w:b/>
-                <w:bCs/>
-              </w:rPr>
-              <w:t>datasets</w:t>
-            </w:r>
-            <w:proofErr w:type="spellEnd"/>
-            <w:r>
-              <w:rPr>
-                <w:b/>
-                <w:bCs/>
-              </w:rPr>
-              <w:t xml:space="preserve"> sintéticos coherentes</w:t>
+            <w:r>
+              <w:rPr>
+                <w:b/>
+                <w:bCs/>
+              </w:rPr>
+              <w:t>datasets sintéticos coherentes</w:t>
             </w:r>
             <w:r>
               <w:t xml:space="preserve"> y validación mixta (real + simulado) mientras se habilita el piloto.</w:t>
@@ -3454,28 +3182,11 @@
                 <w:b/>
                 <w:bCs/>
               </w:rPr>
-              <w:t xml:space="preserve">Calcular y publicar </w:t>
-            </w:r>
-            <w:proofErr w:type="spellStart"/>
-            <w:r>
-              <w:rPr>
-                <w:b/>
-                <w:bCs/>
-              </w:rPr>
-              <w:t>KPIs</w:t>
-            </w:r>
-            <w:proofErr w:type="spellEnd"/>
-            <w:r>
-              <w:rPr>
-                <w:b/>
-                <w:bCs/>
-              </w:rPr>
-              <w:t xml:space="preserve"> operativos</w:t>
+              <w:t>Calcular y publicar KPIs operativos</w:t>
             </w:r>
             <w:r>
               <w:t xml:space="preserve"> (rotación, merma, quiebres, cobertura y diferencia entre venta esperada y real) en un </w:t>
             </w:r>
-            <w:proofErr w:type="spellStart"/>
             <w:r>
               <w:rPr>
                 <w:b/>
@@ -3483,7 +3194,6 @@
               </w:rPr>
               <w:t>dashboard</w:t>
             </w:r>
-            <w:proofErr w:type="spellEnd"/>
             <w:r>
               <w:t xml:space="preserve"> actualizado diariamente.</w:t>
             </w:r>
@@ -3519,17 +3229,8 @@
                 <w:b/>
                 <w:bCs/>
               </w:rPr>
-              <w:t xml:space="preserve">top 20 </w:t>
-            </w:r>
-            <w:proofErr w:type="spellStart"/>
-            <w:r>
-              <w:rPr>
-                <w:b/>
-                <w:bCs/>
-              </w:rPr>
-              <w:t>SKUs</w:t>
-            </w:r>
-            <w:proofErr w:type="spellEnd"/>
+              <w:t>top 20 SKUs</w:t>
+            </w:r>
             <w:r>
               <w:t xml:space="preserve"> con </w:t>
             </w:r>
@@ -3672,17 +3373,8 @@
                 <w:b/>
                 <w:bCs/>
               </w:rPr>
-              <w:t xml:space="preserve">recoger </w:t>
-            </w:r>
-            <w:proofErr w:type="spellStart"/>
-            <w:r>
-              <w:rPr>
-                <w:b/>
-                <w:bCs/>
-              </w:rPr>
-              <w:t>feedback</w:t>
-            </w:r>
-            <w:proofErr w:type="spellEnd"/>
+              <w:t>recoger feedback</w:t>
+            </w:r>
             <w:r>
               <w:t xml:space="preserve"> de usuarios y </w:t>
             </w:r>
@@ -3853,15 +3545,7 @@
               <w:t>un enfoque ágil e incremental</w:t>
             </w:r>
             <w:r>
-              <w:t xml:space="preserve">: iteraciones cortas, entregables demostrables y ajustes sobre evidencia. El objetivo es construir un MVP que capture, depure y consolide datos operacionales para calcular </w:t>
-            </w:r>
-            <w:proofErr w:type="spellStart"/>
-            <w:r>
-              <w:t>KPIs</w:t>
-            </w:r>
-            <w:proofErr w:type="spellEnd"/>
-            <w:r>
-              <w:t>, generar pronósticos y alertas útiles para la decisión diaria</w:t>
+              <w:t>: iteraciones cortas, entregables demostrables y ajustes sobre evidencia. El objetivo es construir un MVP que capture, depure y consolide datos operacionales para calcular KPIs, generar pronósticos y alertas útiles para la decisión diaria</w:t>
             </w:r>
             <w:r>
               <w:rPr>
@@ -3976,17 +3660,8 @@
                 <w:b/>
                 <w:bCs/>
               </w:rPr>
-              <w:t>data-</w:t>
-            </w:r>
-            <w:proofErr w:type="spellStart"/>
-            <w:r>
-              <w:rPr>
-                <w:b/>
-                <w:bCs/>
-              </w:rPr>
-              <w:t>driven</w:t>
-            </w:r>
-            <w:proofErr w:type="spellEnd"/>
+              <w:t>data-driven</w:t>
+            </w:r>
             <w:r>
               <w:t xml:space="preserve">. El foco es: capturar datos operacionales (ventas, movimientos y mermas), </w:t>
             </w:r>
@@ -4000,21 +3675,12 @@
             <w:r>
               <w:t xml:space="preserve">, convertirlos en </w:t>
             </w:r>
-            <w:proofErr w:type="spellStart"/>
-            <w:r>
-              <w:rPr>
-                <w:b/>
-                <w:bCs/>
-              </w:rPr>
-              <w:t>KPIs</w:t>
-            </w:r>
-            <w:proofErr w:type="spellEnd"/>
-            <w:r>
-              <w:rPr>
-                <w:b/>
-                <w:bCs/>
-              </w:rPr>
-              <w:t xml:space="preserve"> accionables</w:t>
+            <w:r>
+              <w:rPr>
+                <w:b/>
+                <w:bCs/>
+              </w:rPr>
+              <w:t>KPIs accionables</w:t>
             </w:r>
             <w:r>
               <w:t xml:space="preserve"> y generar </w:t>
@@ -4027,15 +3693,7 @@
               <w:t>pronósticos y alertas</w:t>
             </w:r>
             <w:r>
-              <w:t xml:space="preserve"> que anticipen quiebres y </w:t>
-            </w:r>
-            <w:proofErr w:type="spellStart"/>
-            <w:r>
-              <w:t>sobrestock</w:t>
-            </w:r>
-            <w:proofErr w:type="spellEnd"/>
-            <w:r>
-              <w:t>.</w:t>
+              <w:t xml:space="preserve"> que anticipen quiebres y sobrestock.</w:t>
             </w:r>
           </w:p>
           <w:p/>
@@ -4057,70 +3715,20 @@
                 <w:b/>
                 <w:bCs/>
               </w:rPr>
-              <w:t xml:space="preserve">enfoque ágil e incremental por </w:t>
-            </w:r>
-            <w:proofErr w:type="spellStart"/>
-            <w:r>
-              <w:rPr>
-                <w:b/>
-                <w:bCs/>
-              </w:rPr>
-              <w:t>sprints</w:t>
-            </w:r>
-            <w:proofErr w:type="spellEnd"/>
-            <w:r>
-              <w:t>, entregando incrementos funcionales y ajustando sobre evidencia (</w:t>
-            </w:r>
-            <w:proofErr w:type="spellStart"/>
-            <w:r>
-              <w:t>build</w:t>
-            </w:r>
-            <w:proofErr w:type="spellEnd"/>
-            <w:r>
-              <w:t>–</w:t>
-            </w:r>
-            <w:proofErr w:type="spellStart"/>
-            <w:r>
-              <w:t>measure</w:t>
-            </w:r>
-            <w:proofErr w:type="spellEnd"/>
-            <w:r>
-              <w:t>–</w:t>
-            </w:r>
-            <w:proofErr w:type="spellStart"/>
-            <w:r>
-              <w:t>learn</w:t>
-            </w:r>
-            <w:proofErr w:type="spellEnd"/>
-            <w:r>
-              <w:t xml:space="preserve">). Las funcionalidades se desarrollan en </w:t>
-            </w:r>
-            <w:r>
-              <w:rPr>
-                <w:b/>
-                <w:bCs/>
-              </w:rPr>
-              <w:t xml:space="preserve">vertical </w:t>
-            </w:r>
-            <w:proofErr w:type="spellStart"/>
-            <w:r>
-              <w:rPr>
-                <w:b/>
-                <w:bCs/>
-              </w:rPr>
-              <w:t>slices</w:t>
-            </w:r>
-            <w:proofErr w:type="spellEnd"/>
-            <w:r>
-              <w:t xml:space="preserve"> (de punta a punta: datos → </w:t>
-            </w:r>
-            <w:proofErr w:type="spellStart"/>
-            <w:r>
-              <w:t>backend</w:t>
-            </w:r>
-            <w:proofErr w:type="spellEnd"/>
-            <w:r>
-              <w:t xml:space="preserve"> → UI), para reducir dependencias y entregar valor visible en cada iteración.</w:t>
+              <w:t>enfoque ágil e incremental por sprints</w:t>
+            </w:r>
+            <w:r>
+              <w:t xml:space="preserve">, entregando incrementos funcionales y ajustando sobre evidencia (build–measure–learn). Las funcionalidades se desarrollan en </w:t>
+            </w:r>
+            <w:r>
+              <w:rPr>
+                <w:b/>
+                <w:bCs/>
+              </w:rPr>
+              <w:t>vertical slices</w:t>
+            </w:r>
+            <w:r>
+              <w:t xml:space="preserve"> (de punta a punta: datos → backend → UI), para reducir dependencias y entregar valor visible en cada iteración.</w:t>
             </w:r>
           </w:p>
           <w:p/>
@@ -4146,7 +3754,6 @@
             <w:r>
               <w:t xml:space="preserve">: mapeo breve de procesos de inventario, definición de </w:t>
             </w:r>
-            <w:proofErr w:type="spellStart"/>
             <w:r>
               <w:rPr>
                 <w:b/>
@@ -4154,7 +3761,6 @@
               </w:rPr>
               <w:t>KPIs</w:t>
             </w:r>
-            <w:proofErr w:type="spellEnd"/>
             <w:r>
               <w:t xml:space="preserve"> y criterios de éxito; glosario y </w:t>
             </w:r>
@@ -4163,17 +3769,8 @@
                 <w:b/>
                 <w:bCs/>
               </w:rPr>
-              <w:t xml:space="preserve">modelo </w:t>
-            </w:r>
-            <w:proofErr w:type="spellStart"/>
-            <w:r>
-              <w:rPr>
-                <w:b/>
-                <w:bCs/>
-              </w:rPr>
-              <w:t>conceptua</w:t>
-            </w:r>
-            <w:proofErr w:type="spellEnd"/>
+              <w:t>modelo conceptua</w:t>
+            </w:r>
           </w:p>
           <w:p>
             <w:pPr>
@@ -4219,15 +3816,7 @@
               <w:t>flujo de trabajo</w:t>
             </w:r>
             <w:r>
-              <w:t xml:space="preserve"> de ingesta desde exportaciones (CSV/Excel; </w:t>
-            </w:r>
-            <w:proofErr w:type="spellStart"/>
-            <w:r>
-              <w:t>APIs</w:t>
-            </w:r>
-            <w:proofErr w:type="spellEnd"/>
-            <w:r>
-              <w:t xml:space="preserve"> cuando existan); reglas de </w:t>
+              <w:t xml:space="preserve"> de ingesta desde exportaciones (CSV/Excel; APIs cuando existan); reglas de </w:t>
             </w:r>
             <w:r>
               <w:rPr>
@@ -4249,21 +3838,12 @@
             <w:r>
               <w:t xml:space="preserve"> de transformaciones. Si faltan históricos, se generan </w:t>
             </w:r>
-            <w:proofErr w:type="spellStart"/>
-            <w:r>
-              <w:rPr>
-                <w:b/>
-                <w:bCs/>
-              </w:rPr>
-              <w:t>datasets</w:t>
-            </w:r>
-            <w:proofErr w:type="spellEnd"/>
-            <w:r>
-              <w:rPr>
-                <w:b/>
-                <w:bCs/>
-              </w:rPr>
-              <w:t xml:space="preserve"> sintéticos</w:t>
+            <w:r>
+              <w:rPr>
+                <w:b/>
+                <w:bCs/>
+              </w:rPr>
+              <w:t>datasets sintéticos</w:t>
             </w:r>
             <w:r>
               <w:t xml:space="preserve"> coherentes para pruebas.</w:t>
@@ -4283,42 +3863,17 @@
                 <w:b/>
                 <w:bCs/>
               </w:rPr>
-              <w:t xml:space="preserve">Producto – </w:t>
-            </w:r>
-            <w:proofErr w:type="spellStart"/>
-            <w:r>
-              <w:rPr>
-                <w:b/>
-                <w:bCs/>
-              </w:rPr>
-              <w:t>KPIs</w:t>
-            </w:r>
-            <w:proofErr w:type="spellEnd"/>
-            <w:r>
-              <w:rPr>
-                <w:b/>
-                <w:bCs/>
-              </w:rPr>
-              <w:t xml:space="preserve"> y visualización</w:t>
+              <w:t>Producto – KPIs y visualización</w:t>
             </w:r>
             <w:r>
               <w:t xml:space="preserve">: servicios para consolidar datos y cálculo de indicadores (rotación, merma, quiebres, cobertura, desvío esperado–real); </w:t>
             </w:r>
-            <w:proofErr w:type="spellStart"/>
-            <w:r>
-              <w:rPr>
-                <w:b/>
-                <w:bCs/>
-              </w:rPr>
-              <w:t>dashboard</w:t>
-            </w:r>
-            <w:proofErr w:type="spellEnd"/>
-            <w:r>
-              <w:rPr>
-                <w:b/>
-                <w:bCs/>
-              </w:rPr>
-              <w:t xml:space="preserve"> operativo</w:t>
+            <w:r>
+              <w:rPr>
+                <w:b/>
+                <w:bCs/>
+              </w:rPr>
+              <w:t>dashboard operativo</w:t>
             </w:r>
             <w:r>
               <w:t xml:space="preserve"> con actualización diaria.</w:t>
@@ -4441,15 +3996,7 @@
               <w:t>1–2 locales</w:t>
             </w:r>
             <w:r>
-              <w:t xml:space="preserve">, pruebas con usuarios, recolección de </w:t>
-            </w:r>
-            <w:proofErr w:type="spellStart"/>
-            <w:r>
-              <w:t>feedback</w:t>
-            </w:r>
-            <w:proofErr w:type="spellEnd"/>
-            <w:r>
-              <w:t xml:space="preserve"> y </w:t>
+              <w:t xml:space="preserve">, pruebas con usuarios, recolección de feedback y </w:t>
             </w:r>
             <w:r>
               <w:rPr>
@@ -4496,23 +4043,7 @@
               <w:t>Nicolás Caviedes</w:t>
             </w:r>
             <w:r>
-              <w:t xml:space="preserve"> — Project Manager: planificación por </w:t>
-            </w:r>
-            <w:proofErr w:type="spellStart"/>
-            <w:r>
-              <w:t>sprints</w:t>
-            </w:r>
-            <w:proofErr w:type="spellEnd"/>
-            <w:r>
-              <w:t xml:space="preserve">, priorización del backlog, coordinación con </w:t>
-            </w:r>
-            <w:proofErr w:type="spellStart"/>
-            <w:r>
-              <w:t>stakeholders</w:t>
-            </w:r>
-            <w:proofErr w:type="spellEnd"/>
-            <w:r>
-              <w:t>/piloto, gestión de riesgos, definición de criterios de aceptación y seguimiento de hitos.</w:t>
+              <w:t xml:space="preserve"> — Project Manager: planificación por sprints, priorización del backlog, coordinación con stakeholders/piloto, gestión de riesgos, definición de criterios de aceptación y seguimiento de hitos.</w:t>
             </w:r>
           </w:p>
           <w:p>
@@ -4531,31 +4062,7 @@
               <w:t>Sergio Plaza</w:t>
             </w:r>
             <w:r>
-              <w:t xml:space="preserve"> — Líder de Proyecto / Arquitecto &amp; Datos: arquitectura y estándares, modelo de datos y </w:t>
-            </w:r>
-            <w:proofErr w:type="spellStart"/>
-            <w:r>
-              <w:t>KPIs</w:t>
-            </w:r>
-            <w:proofErr w:type="spellEnd"/>
-            <w:r>
-              <w:t xml:space="preserve">, lineamientos de calidad, decisiones técnicas, </w:t>
-            </w:r>
-            <w:proofErr w:type="spellStart"/>
-            <w:r>
-              <w:t>code</w:t>
-            </w:r>
-            <w:proofErr w:type="spellEnd"/>
-            <w:r>
-              <w:t xml:space="preserve"> </w:t>
-            </w:r>
-            <w:proofErr w:type="spellStart"/>
-            <w:r>
-              <w:t>reviews</w:t>
-            </w:r>
-            <w:proofErr w:type="spellEnd"/>
-            <w:r>
-              <w:t>, soporte a CI/CD y validación de umbrales/alertas.</w:t>
+              <w:t xml:space="preserve"> — Líder de Proyecto / Arquitecto &amp; Datos: arquitectura y estándares, modelo de datos y KPIs, lineamientos de calidad, decisiones técnicas, code reviews, soporte a CI/CD y validación de umbrales/alertas.</w:t>
             </w:r>
           </w:p>
           <w:p>
@@ -4566,56 +4073,15 @@
                 <w:numId w:val="16"/>
               </w:numPr>
             </w:pPr>
-            <w:proofErr w:type="spellStart"/>
-            <w:r>
-              <w:rPr>
-                <w:b/>
-                <w:bCs/>
-              </w:rPr>
-              <w:t>Yojan</w:t>
-            </w:r>
-            <w:proofErr w:type="spellEnd"/>
-            <w:r>
-              <w:rPr>
-                <w:b/>
-                <w:bCs/>
-              </w:rPr>
-              <w:t xml:space="preserve"> Cortes</w:t>
-            </w:r>
-            <w:r>
-              <w:t xml:space="preserve"> — Desarrollador Full-</w:t>
-            </w:r>
-            <w:proofErr w:type="spellStart"/>
-            <w:r>
-              <w:t>Stack</w:t>
-            </w:r>
-            <w:proofErr w:type="spellEnd"/>
-            <w:r>
-              <w:t xml:space="preserve">: desarrollo </w:t>
-            </w:r>
-            <w:proofErr w:type="spellStart"/>
-            <w:r>
-              <w:t>end-to-end</w:t>
-            </w:r>
-            <w:proofErr w:type="spellEnd"/>
-            <w:r>
-              <w:t xml:space="preserve"> por </w:t>
-            </w:r>
-            <w:proofErr w:type="spellStart"/>
-            <w:r>
-              <w:t>feature</w:t>
-            </w:r>
-            <w:proofErr w:type="spellEnd"/>
-            <w:r>
-              <w:t xml:space="preserve"> (modelo/persistencia, API y UI), ingesta/limpieza básica de datos para su </w:t>
-            </w:r>
-            <w:proofErr w:type="spellStart"/>
-            <w:r>
-              <w:t>feature</w:t>
-            </w:r>
-            <w:proofErr w:type="spellEnd"/>
-            <w:r>
-              <w:t>, pruebas y documentación breve.</w:t>
+            <w:r>
+              <w:rPr>
+                <w:b/>
+                <w:bCs/>
+              </w:rPr>
+              <w:t>Yojan Cortes</w:t>
+            </w:r>
+            <w:r>
+              <w:t xml:space="preserve"> — Desarrollador Full-Stack: desarrollo end-to-end por feature (modelo/persistencia, API y UI), ingesta/limpieza básica de datos para su feature, pruebas y documentación breve.</w:t>
             </w:r>
           </w:p>
           <w:p>
@@ -4634,39 +4100,7 @@
               <w:t>Néstor Barrera</w:t>
             </w:r>
             <w:r>
-              <w:t xml:space="preserve"> — Desarrollador Full-</w:t>
-            </w:r>
-            <w:proofErr w:type="spellStart"/>
-            <w:r>
-              <w:t>Stack</w:t>
-            </w:r>
-            <w:proofErr w:type="spellEnd"/>
-            <w:r>
-              <w:t xml:space="preserve">: desarrollo </w:t>
-            </w:r>
-            <w:proofErr w:type="spellStart"/>
-            <w:r>
-              <w:t>end-to-end</w:t>
-            </w:r>
-            <w:proofErr w:type="spellEnd"/>
-            <w:r>
-              <w:t xml:space="preserve"> por </w:t>
-            </w:r>
-            <w:proofErr w:type="spellStart"/>
-            <w:r>
-              <w:t>feature</w:t>
-            </w:r>
-            <w:proofErr w:type="spellEnd"/>
-            <w:r>
-              <w:t xml:space="preserve"> (persistencia, API y UI), diseño/UX del </w:t>
-            </w:r>
-            <w:proofErr w:type="spellStart"/>
-            <w:r>
-              <w:t>dashboard</w:t>
-            </w:r>
-            <w:proofErr w:type="spellEnd"/>
-            <w:r>
-              <w:t>, pruebas y documentación breve.</w:t>
+              <w:t xml:space="preserve"> — Desarrollador Full-Stack: desarrollo end-to-end por feature (persistencia, API y UI), diseño/UX del dashboard, pruebas y documentación breve.</w:t>
             </w:r>
           </w:p>
           <w:p/>
@@ -4699,23 +4133,7 @@
                 <w:b/>
                 <w:bCs/>
               </w:rPr>
-              <w:t xml:space="preserve">Trabajo por </w:t>
-            </w:r>
-            <w:proofErr w:type="spellStart"/>
-            <w:r>
-              <w:rPr>
-                <w:b/>
-                <w:bCs/>
-              </w:rPr>
-              <w:t>sprints</w:t>
-            </w:r>
-            <w:proofErr w:type="spellEnd"/>
-            <w:r>
-              <w:rPr>
-                <w:b/>
-                <w:bCs/>
-              </w:rPr>
-              <w:t xml:space="preserve"> semanales.</w:t>
+              <w:t>Trabajo por sprints semanales.</w:t>
             </w:r>
             <w:r>
               <w:t xml:space="preserve"> Reunión de planificación al inicio; ejecución de tareas; </w:t>
@@ -4774,15 +4192,7 @@
               <w:t>Paralelo y sin dependencias innecesarias.</w:t>
             </w:r>
             <w:r>
-              <w:t xml:space="preserve"> </w:t>
-            </w:r>
-            <w:proofErr w:type="spellStart"/>
-            <w:r>
-              <w:t>Yojan</w:t>
-            </w:r>
-            <w:proofErr w:type="spellEnd"/>
-            <w:r>
-              <w:t xml:space="preserve"> y Néstor toman funcionalidades completas </w:t>
+              <w:t xml:space="preserve"> Yojan y Néstor toman funcionalidades completas </w:t>
             </w:r>
             <w:r>
               <w:rPr>
@@ -4812,59 +4222,23 @@
             <w:r>
               <w:t xml:space="preserve"> Todo cambio pasa por </w:t>
             </w:r>
-            <w:proofErr w:type="spellStart"/>
-            <w:r>
-              <w:rPr>
-                <w:b/>
-                <w:bCs/>
-              </w:rPr>
-              <w:t>Pull</w:t>
-            </w:r>
-            <w:proofErr w:type="spellEnd"/>
-            <w:r>
-              <w:rPr>
-                <w:b/>
-                <w:bCs/>
-              </w:rPr>
-              <w:t xml:space="preserve"> </w:t>
-            </w:r>
-            <w:proofErr w:type="spellStart"/>
-            <w:r>
-              <w:rPr>
-                <w:b/>
-                <w:bCs/>
-              </w:rPr>
-              <w:t>Request</w:t>
-            </w:r>
-            <w:proofErr w:type="spellEnd"/>
+            <w:r>
+              <w:rPr>
+                <w:b/>
+                <w:bCs/>
+              </w:rPr>
+              <w:t>Pull Request</w:t>
+            </w:r>
             <w:r>
               <w:t xml:space="preserve"> y </w:t>
             </w:r>
-            <w:proofErr w:type="spellStart"/>
-            <w:r>
-              <w:rPr>
-                <w:b/>
-                <w:bCs/>
-              </w:rPr>
-              <w:t>code</w:t>
-            </w:r>
-            <w:proofErr w:type="spellEnd"/>
-            <w:r>
-              <w:rPr>
-                <w:b/>
-                <w:bCs/>
-              </w:rPr>
-              <w:t xml:space="preserve"> </w:t>
-            </w:r>
-            <w:proofErr w:type="spellStart"/>
-            <w:r>
-              <w:rPr>
-                <w:b/>
-                <w:bCs/>
-              </w:rPr>
-              <w:t>review</w:t>
-            </w:r>
-            <w:proofErr w:type="spellEnd"/>
+            <w:r>
+              <w:rPr>
+                <w:b/>
+                <w:bCs/>
+              </w:rPr>
+              <w:t>code review</w:t>
+            </w:r>
             <w:r>
               <w:t xml:space="preserve"> entre los desarrolladores; Sergio valida decisiones técnicas.</w:t>
             </w:r>
@@ -4881,23 +4255,7 @@
                 <w:b/>
                 <w:bCs/>
               </w:rPr>
-              <w:t>Definición de “Terminado” (</w:t>
-            </w:r>
-            <w:proofErr w:type="spellStart"/>
-            <w:r>
-              <w:rPr>
-                <w:b/>
-                <w:bCs/>
-              </w:rPr>
-              <w:t>DoD</w:t>
-            </w:r>
-            <w:proofErr w:type="spellEnd"/>
-            <w:r>
-              <w:rPr>
-                <w:b/>
-                <w:bCs/>
-              </w:rPr>
-              <w:t>).</w:t>
+              <w:t>Definición de “Terminado” (DoD).</w:t>
             </w:r>
             <w:r>
               <w:t xml:space="preserve"> Datos validados, lógica implementada, pruebas básicas OK, pantalla funcionando, criterios de aceptación cumplidos y </w:t>
@@ -4928,23 +4286,7 @@
               <w:t>Control de versiones y CI/CD.</w:t>
             </w:r>
             <w:r>
-              <w:t xml:space="preserve"> Ramas por funcionalidad (</w:t>
-            </w:r>
-            <w:proofErr w:type="spellStart"/>
-            <w:r>
-              <w:t>feature</w:t>
-            </w:r>
-            <w:proofErr w:type="spellEnd"/>
-            <w:r>
-              <w:t xml:space="preserve">/*), </w:t>
-            </w:r>
-            <w:proofErr w:type="spellStart"/>
-            <w:r>
-              <w:t>main</w:t>
-            </w:r>
-            <w:proofErr w:type="spellEnd"/>
-            <w:r>
-              <w:t xml:space="preserve"> estable; compilación y pruebas automáticas; despliegue del </w:t>
+              <w:t xml:space="preserve"> Ramas por funcionalidad (feature/*), main estable; compilación y pruebas automáticas; despliegue del </w:t>
             </w:r>
             <w:r>
               <w:rPr>
@@ -4982,15 +4324,7 @@
               <w:t>calidad de datos ≥ 95%</w:t>
             </w:r>
             <w:r>
-              <w:t xml:space="preserve">, tiempos de carga del </w:t>
-            </w:r>
-            <w:proofErr w:type="spellStart"/>
-            <w:r>
-              <w:t>dashboard</w:t>
-            </w:r>
-            <w:proofErr w:type="spellEnd"/>
-            <w:r>
-              <w:t xml:space="preserve">, </w:t>
+              <w:t xml:space="preserve">, tiempos de carga del dashboard, </w:t>
             </w:r>
             <w:r>
               <w:rPr>
@@ -5036,15 +4370,7 @@
               <w:t>Evidencias.</w:t>
             </w:r>
             <w:r>
-              <w:t xml:space="preserve"> Actas de sprint, tablero actualizado, scripts de ingesta/limpieza, capturas del </w:t>
-            </w:r>
-            <w:proofErr w:type="spellStart"/>
-            <w:r>
-              <w:t>dashboard</w:t>
-            </w:r>
-            <w:proofErr w:type="spellEnd"/>
-            <w:r>
-              <w:t>, logs de ejecución y reporte breve de validación.</w:t>
+              <w:t xml:space="preserve"> Actas de sprint, tablero actualizado, scripts de ingesta/limpieza, capturas del dashboard, logs de ejecución y reporte breve de validación.</w:t>
             </w:r>
           </w:p>
           <w:p>
@@ -5062,29 +4388,16 @@
               <w:t>Comunicación.</w:t>
             </w:r>
             <w:r>
-              <w:t xml:space="preserve"> </w:t>
-            </w:r>
-            <w:proofErr w:type="gramStart"/>
-            <w:r>
-              <w:t>Canal</w:t>
+              <w:t xml:space="preserve"> Canal</w:t>
             </w:r>
             <w:r>
               <w:t>es</w:t>
             </w:r>
             <w:r>
-              <w:t xml:space="preserve"> único</w:t>
-            </w:r>
-            <w:proofErr w:type="gramEnd"/>
-            <w:r>
-              <w:t xml:space="preserve"> (WhatsApp/</w:t>
-            </w:r>
-            <w:proofErr w:type="spellStart"/>
-            <w:r>
-              <w:t>Discord</w:t>
-            </w:r>
-            <w:proofErr w:type="spellEnd"/>
-            <w:r>
-              <w:t>/Correos</w:t>
+              <w:t xml:space="preserve"> único (WhatsApp/</w:t>
+            </w:r>
+            <w:r>
+              <w:t>Discord/Correos</w:t>
             </w:r>
             <w:r>
               <w:t>) y reunión corta semanal con responsables y acuerdos por escrito.</w:t>
@@ -5491,23 +4804,7 @@
                 <w:rFonts w:ascii="Aptos Narrow" w:hAnsi="Aptos Narrow"/>
                 <w:color w:val="000000"/>
               </w:rPr>
-              <w:t xml:space="preserve">Diseño de pantallas en </w:t>
-            </w:r>
-            <w:proofErr w:type="spellStart"/>
-            <w:r>
-              <w:rPr>
-                <w:rFonts w:ascii="Aptos Narrow" w:hAnsi="Aptos Narrow"/>
-                <w:color w:val="000000"/>
-              </w:rPr>
-              <w:t>Figma</w:t>
-            </w:r>
-            <w:proofErr w:type="spellEnd"/>
-            <w:r>
-              <w:rPr>
-                <w:rFonts w:ascii="Aptos Narrow" w:hAnsi="Aptos Narrow"/>
-                <w:color w:val="000000"/>
-              </w:rPr>
-              <w:t xml:space="preserve"> con flujo básico de inventario, reportes y predicción.</w:t>
+              <w:t>Diseño de pantallas en Figma con flujo básico de inventario, reportes y predicción.</w:t>
             </w:r>
           </w:p>
         </w:tc>
@@ -5736,23 +5033,7 @@
                 <w:rFonts w:ascii="Aptos Narrow" w:hAnsi="Aptos Narrow"/>
                 <w:color w:val="000000"/>
               </w:rPr>
-              <w:t xml:space="preserve">Garantiza que los datos sean confiables antes de generar </w:t>
-            </w:r>
-            <w:proofErr w:type="spellStart"/>
-            <w:r>
-              <w:rPr>
-                <w:rFonts w:ascii="Aptos Narrow" w:hAnsi="Aptos Narrow"/>
-                <w:color w:val="000000"/>
-              </w:rPr>
-              <w:t>KPIs</w:t>
-            </w:r>
-            <w:proofErr w:type="spellEnd"/>
-            <w:r>
-              <w:rPr>
-                <w:rFonts w:ascii="Aptos Narrow" w:hAnsi="Aptos Narrow"/>
-                <w:color w:val="000000"/>
-              </w:rPr>
-              <w:t xml:space="preserve"> o predicciones.</w:t>
+              <w:t>Garantiza que los datos sean confiables antes de generar KPIs o predicciones.</w:t>
             </w:r>
           </w:p>
         </w:tc>
@@ -5802,7 +5083,6 @@
                 <w:color w:val="1F3864" w:themeColor="accent1" w:themeShade="80"/>
               </w:rPr>
             </w:pPr>
-            <w:proofErr w:type="spellStart"/>
             <w:r>
               <w:rPr>
                 <w:rFonts w:ascii="Aptos Narrow" w:hAnsi="Aptos Narrow"/>
@@ -5810,37 +5090,7 @@
                 <w:bCs/>
                 <w:color w:val="000000"/>
               </w:rPr>
-              <w:t>Dashboard</w:t>
-            </w:r>
-            <w:proofErr w:type="spellEnd"/>
-            <w:r>
-              <w:rPr>
-                <w:rFonts w:ascii="Aptos Narrow" w:hAnsi="Aptos Narrow"/>
-                <w:b/>
-                <w:bCs/>
-                <w:color w:val="000000"/>
-              </w:rPr>
-              <w:t xml:space="preserve"> con </w:t>
-            </w:r>
-            <w:proofErr w:type="spellStart"/>
-            <w:r>
-              <w:rPr>
-                <w:rFonts w:ascii="Aptos Narrow" w:hAnsi="Aptos Narrow"/>
-                <w:b/>
-                <w:bCs/>
-                <w:color w:val="000000"/>
-              </w:rPr>
-              <w:t>KPIs</w:t>
-            </w:r>
-            <w:proofErr w:type="spellEnd"/>
-            <w:r>
-              <w:rPr>
-                <w:rFonts w:ascii="Aptos Narrow" w:hAnsi="Aptos Narrow"/>
-                <w:b/>
-                <w:bCs/>
-                <w:color w:val="000000"/>
-              </w:rPr>
-              <w:t xml:space="preserve"> y reportes</w:t>
+              <w:t>Dashboard con KPIs y reportes</w:t>
             </w:r>
           </w:p>
         </w:tc>
@@ -5993,23 +5243,7 @@
                 <w:rFonts w:ascii="Aptos Narrow" w:hAnsi="Aptos Narrow"/>
                 <w:color w:val="000000"/>
               </w:rPr>
-              <w:t>Demuestra el valor práctico del proyecto (menos quiebres/</w:t>
-            </w:r>
-            <w:proofErr w:type="spellStart"/>
-            <w:r>
-              <w:rPr>
-                <w:rFonts w:ascii="Aptos Narrow" w:hAnsi="Aptos Narrow"/>
-                <w:color w:val="000000"/>
-              </w:rPr>
-              <w:t>sobrestock</w:t>
-            </w:r>
-            <w:proofErr w:type="spellEnd"/>
-            <w:r>
-              <w:rPr>
-                <w:rFonts w:ascii="Aptos Narrow" w:hAnsi="Aptos Narrow"/>
-                <w:color w:val="000000"/>
-              </w:rPr>
-              <w:t>, guía de acción para negocios).</w:t>
+              <w:t>Demuestra el valor práctico del proyecto (menos quiebres/sobrestock, guía de acción para negocios).</w:t>
             </w:r>
           </w:p>
         </w:tc>
@@ -6228,23 +5462,7 @@
                 <w:rFonts w:ascii="Calibri" w:hAnsi="Calibri"/>
                 <w:color w:val="1F3864" w:themeColor="accent1" w:themeShade="80"/>
               </w:rPr>
-              <w:t xml:space="preserve">efine la planificación de tu Proyecto APT </w:t>
-            </w:r>
-            <w:proofErr w:type="gramStart"/>
-            <w:r>
-              <w:rPr>
-                <w:rFonts w:ascii="Calibri" w:hAnsi="Calibri"/>
-                <w:color w:val="1F3864" w:themeColor="accent1" w:themeShade="80"/>
-              </w:rPr>
-              <w:t>de acuerdo a</w:t>
-            </w:r>
-            <w:proofErr w:type="gramEnd"/>
-            <w:r>
-              <w:rPr>
-                <w:rFonts w:ascii="Calibri" w:hAnsi="Calibri"/>
-                <w:color w:val="1F3864" w:themeColor="accent1" w:themeShade="80"/>
-              </w:rPr>
-              <w:t xml:space="preserve"> lo requerido</w:t>
+              <w:t>efine la planificación de tu Proyecto APT de acuerdo a lo requerido</w:t>
             </w:r>
             <w:r>
               <w:rPr>
@@ -6382,30 +5600,14 @@
                 <w:rFonts w:ascii="Calibri" w:hAnsi="Calibri"/>
                 <w:color w:val="1F3864" w:themeColor="accent1" w:themeShade="80"/>
               </w:rPr>
-              <w:t xml:space="preserve">Nombre </w:t>
-            </w:r>
-            <w:proofErr w:type="gramStart"/>
+              <w:t xml:space="preserve">Nombre de </w:t>
+            </w:r>
             <w:r>
               <w:rPr>
                 <w:rFonts w:ascii="Calibri" w:hAnsi="Calibri"/>
                 <w:color w:val="1F3864" w:themeColor="accent1" w:themeShade="80"/>
               </w:rPr>
-              <w:t xml:space="preserve">de </w:t>
-            </w:r>
-            <w:r>
-              <w:rPr>
-                <w:rFonts w:ascii="Calibri" w:hAnsi="Calibri"/>
-                <w:color w:val="1F3864" w:themeColor="accent1" w:themeShade="80"/>
-              </w:rPr>
-              <w:t xml:space="preserve"> Actividades</w:t>
-            </w:r>
-            <w:proofErr w:type="gramEnd"/>
-            <w:r>
-              <w:rPr>
-                <w:rFonts w:ascii="Calibri" w:hAnsi="Calibri"/>
-                <w:color w:val="1F3864" w:themeColor="accent1" w:themeShade="80"/>
-              </w:rPr>
-              <w:t>/Tareas</w:t>
+              <w:t xml:space="preserve"> Actividades/Tareas</w:t>
             </w:r>
           </w:p>
         </w:tc>
@@ -6660,31 +5862,7 @@
                 <w:szCs w:val="20"/>
                 <w:lang w:eastAsia="es-CL"/>
               </w:rPr>
-              <w:t xml:space="preserve">Jira/Trello, </w:t>
-            </w:r>
-            <w:proofErr w:type="spellStart"/>
-            <w:r>
-              <w:rPr>
-                <w:rFonts w:ascii="Calibri" w:hAnsi="Calibri" w:cs="Arial"/>
-                <w:i/>
-                <w:color w:val="548DD4"/>
-                <w:sz w:val="18"/>
-                <w:szCs w:val="20"/>
-                <w:lang w:eastAsia="es-CL"/>
-              </w:rPr>
-              <w:t>Instagantt</w:t>
-            </w:r>
-            <w:proofErr w:type="spellEnd"/>
-            <w:r>
-              <w:rPr>
-                <w:rFonts w:ascii="Calibri" w:hAnsi="Calibri" w:cs="Arial"/>
-                <w:i/>
-                <w:color w:val="548DD4"/>
-                <w:sz w:val="18"/>
-                <w:szCs w:val="20"/>
-                <w:lang w:eastAsia="es-CL"/>
-              </w:rPr>
-              <w:t>, Google Drive</w:t>
+              <w:t>Jira/Trello, Instagantt, Google Drive</w:t>
             </w:r>
           </w:p>
         </w:tc>
@@ -7138,31 +6316,7 @@
                 <w:szCs w:val="20"/>
                 <w:lang w:eastAsia="es-CL"/>
               </w:rPr>
-              <w:t xml:space="preserve">Maquetas de inventario, movimientos, </w:t>
-            </w:r>
-            <w:proofErr w:type="spellStart"/>
-            <w:r>
-              <w:rPr>
-                <w:rFonts w:ascii="Calibri" w:hAnsi="Calibri" w:cs="Arial"/>
-                <w:i/>
-                <w:color w:val="548DD4"/>
-                <w:sz w:val="18"/>
-                <w:szCs w:val="20"/>
-                <w:lang w:eastAsia="es-CL"/>
-              </w:rPr>
-              <w:t>dashboard</w:t>
-            </w:r>
-            <w:proofErr w:type="spellEnd"/>
-            <w:r>
-              <w:rPr>
-                <w:rFonts w:ascii="Calibri" w:hAnsi="Calibri" w:cs="Arial"/>
-                <w:i/>
-                <w:color w:val="548DD4"/>
-                <w:sz w:val="18"/>
-                <w:szCs w:val="20"/>
-                <w:lang w:eastAsia="es-CL"/>
-              </w:rPr>
-              <w:t xml:space="preserve"> y navegación.</w:t>
+              <w:t>Maquetas de inventario, movimientos, dashboard y navegación.</w:t>
             </w:r>
           </w:p>
         </w:tc>
@@ -7182,43 +6336,17 @@
                 <w:lang w:eastAsia="es-CL"/>
               </w:rPr>
             </w:pPr>
-            <w:proofErr w:type="spellStart"/>
-            <w:r>
-              <w:rPr>
-                <w:rFonts w:ascii="Calibri" w:hAnsi="Calibri" w:cs="Arial"/>
-                <w:i/>
-                <w:color w:val="548DD4"/>
-                <w:sz w:val="18"/>
-                <w:szCs w:val="20"/>
-                <w:lang w:eastAsia="es-CL"/>
-              </w:rPr>
-              <w:t>Figma</w:t>
-            </w:r>
-            <w:proofErr w:type="spellEnd"/>
-            <w:r>
-              <w:rPr>
-                <w:rFonts w:ascii="Calibri" w:hAnsi="Calibri" w:cs="Arial"/>
-                <w:i/>
-                <w:color w:val="548DD4"/>
-                <w:sz w:val="18"/>
-                <w:szCs w:val="20"/>
-                <w:lang w:eastAsia="es-CL"/>
-              </w:rPr>
-              <w:t>/</w:t>
-            </w:r>
-            <w:proofErr w:type="spellStart"/>
-            <w:r>
-              <w:rPr>
-                <w:rFonts w:ascii="Calibri" w:hAnsi="Calibri" w:cs="Arial"/>
-                <w:i/>
-                <w:color w:val="548DD4"/>
-                <w:sz w:val="18"/>
-                <w:szCs w:val="20"/>
-                <w:lang w:eastAsia="es-CL"/>
-              </w:rPr>
-              <w:t>Excalidraw</w:t>
-            </w:r>
-            <w:proofErr w:type="spellEnd"/>
+            <w:r>
+              <w:rPr>
+                <w:rFonts w:ascii="Calibri" w:hAnsi="Calibri" w:cs="Arial"/>
+                <w:i/>
+                <w:color w:val="548DD4"/>
+                <w:sz w:val="18"/>
+                <w:szCs w:val="20"/>
+                <w:lang w:eastAsia="es-CL"/>
+              </w:rPr>
+              <w:t>Figma/Excalidraw</w:t>
+            </w:r>
           </w:p>
         </w:tc>
         <w:tc>
@@ -7273,7 +6401,6 @@
                 <w:lang w:eastAsia="es-CL"/>
               </w:rPr>
             </w:pPr>
-            <w:proofErr w:type="spellStart"/>
             <w:r>
               <w:rPr>
                 <w:rFonts w:ascii="Calibri" w:hAnsi="Calibri" w:cs="Arial"/>
@@ -7285,7 +6412,6 @@
               </w:rPr>
               <w:t>Nestor</w:t>
             </w:r>
-            <w:proofErr w:type="spellEnd"/>
           </w:p>
         </w:tc>
         <w:tc>
@@ -7405,55 +6531,7 @@
                 <w:szCs w:val="20"/>
                 <w:lang w:eastAsia="es-CL"/>
               </w:rPr>
-              <w:t>Creación de repos, ramas, PR/</w:t>
-            </w:r>
-            <w:proofErr w:type="spellStart"/>
-            <w:r>
-              <w:rPr>
-                <w:rFonts w:ascii="Calibri" w:hAnsi="Calibri" w:cs="Arial"/>
-                <w:i/>
-                <w:color w:val="548DD4"/>
-                <w:sz w:val="18"/>
-                <w:szCs w:val="20"/>
-                <w:lang w:eastAsia="es-CL"/>
-              </w:rPr>
-              <w:t>reviews</w:t>
-            </w:r>
-            <w:proofErr w:type="spellEnd"/>
-            <w:r>
-              <w:rPr>
-                <w:rFonts w:ascii="Calibri" w:hAnsi="Calibri" w:cs="Arial"/>
-                <w:i/>
-                <w:color w:val="548DD4"/>
-                <w:sz w:val="18"/>
-                <w:szCs w:val="20"/>
-                <w:lang w:eastAsia="es-CL"/>
-              </w:rPr>
-              <w:t xml:space="preserve"> y pipeline de </w:t>
-            </w:r>
-            <w:proofErr w:type="spellStart"/>
-            <w:r>
-              <w:rPr>
-                <w:rFonts w:ascii="Calibri" w:hAnsi="Calibri" w:cs="Arial"/>
-                <w:i/>
-                <w:color w:val="548DD4"/>
-                <w:sz w:val="18"/>
-                <w:szCs w:val="20"/>
-                <w:lang w:eastAsia="es-CL"/>
-              </w:rPr>
-              <w:t>build</w:t>
-            </w:r>
-            <w:proofErr w:type="spellEnd"/>
-            <w:r>
-              <w:rPr>
-                <w:rFonts w:ascii="Calibri" w:hAnsi="Calibri" w:cs="Arial"/>
-                <w:i/>
-                <w:color w:val="548DD4"/>
-                <w:sz w:val="18"/>
-                <w:szCs w:val="20"/>
-                <w:lang w:eastAsia="es-CL"/>
-              </w:rPr>
-              <w:t>/pruebas.</w:t>
+              <w:t>Creación de repos, ramas, PR/reviews y pipeline de build/pruebas.</w:t>
             </w:r>
           </w:p>
         </w:tc>
@@ -7482,31 +6560,7 @@
                 <w:szCs w:val="20"/>
                 <w:lang w:eastAsia="es-CL"/>
               </w:rPr>
-              <w:t>GitHub/</w:t>
-            </w:r>
-            <w:proofErr w:type="spellStart"/>
-            <w:r>
-              <w:rPr>
-                <w:rFonts w:ascii="Calibri" w:hAnsi="Calibri" w:cs="Arial"/>
-                <w:i/>
-                <w:color w:val="548DD4"/>
-                <w:sz w:val="18"/>
-                <w:szCs w:val="20"/>
-                <w:lang w:eastAsia="es-CL"/>
-              </w:rPr>
-              <w:t>GitLab</w:t>
-            </w:r>
-            <w:proofErr w:type="spellEnd"/>
-            <w:r>
-              <w:rPr>
-                <w:rFonts w:ascii="Calibri" w:hAnsi="Calibri" w:cs="Arial"/>
-                <w:i/>
-                <w:color w:val="548DD4"/>
-                <w:sz w:val="18"/>
-                <w:szCs w:val="20"/>
-                <w:lang w:eastAsia="es-CL"/>
-              </w:rPr>
-              <w:t xml:space="preserve">, </w:t>
+              <w:t xml:space="preserve">GitHub/GitLab, </w:t>
             </w:r>
           </w:p>
         </w:tc>
@@ -7562,7 +6616,6 @@
                 <w:lang w:eastAsia="es-CL"/>
               </w:rPr>
             </w:pPr>
-            <w:proofErr w:type="spellStart"/>
             <w:r>
               <w:rPr>
                 <w:rFonts w:ascii="Calibri" w:hAnsi="Calibri" w:cs="Arial"/>
@@ -7574,7 +6627,6 @@
               </w:rPr>
               <w:t>Yojan</w:t>
             </w:r>
-            <w:proofErr w:type="spellEnd"/>
           </w:p>
         </w:tc>
         <w:tc>
@@ -7732,55 +6784,7 @@
                 <w:szCs w:val="20"/>
                 <w:lang w:eastAsia="es-CL"/>
               </w:rPr>
-              <w:t>Full-</w:t>
-            </w:r>
-            <w:proofErr w:type="spellStart"/>
-            <w:r>
-              <w:rPr>
-                <w:rFonts w:ascii="Calibri" w:hAnsi="Calibri" w:cs="Arial"/>
-                <w:i/>
-                <w:color w:val="548DD4"/>
-                <w:sz w:val="18"/>
-                <w:szCs w:val="20"/>
-                <w:lang w:eastAsia="es-CL"/>
-              </w:rPr>
-              <w:t>Stack</w:t>
-            </w:r>
-            <w:proofErr w:type="spellEnd"/>
-            <w:r>
-              <w:rPr>
-                <w:rFonts w:ascii="Calibri" w:hAnsi="Calibri" w:cs="Arial"/>
-                <w:i/>
-                <w:color w:val="548DD4"/>
-                <w:sz w:val="18"/>
-                <w:szCs w:val="20"/>
-                <w:lang w:eastAsia="es-CL"/>
-              </w:rPr>
-              <w:t xml:space="preserve"> (</w:t>
-            </w:r>
-            <w:proofErr w:type="spellStart"/>
-            <w:r>
-              <w:rPr>
-                <w:rFonts w:ascii="Calibri" w:hAnsi="Calibri" w:cs="Arial"/>
-                <w:i/>
-                <w:color w:val="548DD4"/>
-                <w:sz w:val="18"/>
-                <w:szCs w:val="20"/>
-                <w:lang w:eastAsia="es-CL"/>
-              </w:rPr>
-              <w:t>backend+frontend</w:t>
-            </w:r>
-            <w:proofErr w:type="spellEnd"/>
-            <w:r>
-              <w:rPr>
-                <w:rFonts w:ascii="Calibri" w:hAnsi="Calibri" w:cs="Arial"/>
-                <w:i/>
-                <w:color w:val="548DD4"/>
-                <w:sz w:val="18"/>
-                <w:szCs w:val="20"/>
-                <w:lang w:eastAsia="es-CL"/>
-              </w:rPr>
-              <w:t>)</w:t>
+              <w:t>Full-Stack (backend+frontend)</w:t>
             </w:r>
           </w:p>
         </w:tc>
@@ -7963,31 +6967,7 @@
                 <w:szCs w:val="20"/>
                 <w:lang w:eastAsia="es-CL"/>
               </w:rPr>
-              <w:t xml:space="preserve">IDE, Java (o </w:t>
-            </w:r>
-            <w:proofErr w:type="spellStart"/>
-            <w:r>
-              <w:rPr>
-                <w:rFonts w:ascii="Calibri" w:hAnsi="Calibri" w:cs="Arial"/>
-                <w:i/>
-                <w:color w:val="548DD4"/>
-                <w:sz w:val="18"/>
-                <w:szCs w:val="20"/>
-                <w:lang w:eastAsia="es-CL"/>
-              </w:rPr>
-              <w:t>stack</w:t>
-            </w:r>
-            <w:proofErr w:type="spellEnd"/>
-            <w:r>
-              <w:rPr>
-                <w:rFonts w:ascii="Calibri" w:hAnsi="Calibri" w:cs="Arial"/>
-                <w:i/>
-                <w:color w:val="548DD4"/>
-                <w:sz w:val="18"/>
-                <w:szCs w:val="20"/>
-                <w:lang w:eastAsia="es-CL"/>
-              </w:rPr>
-              <w:t xml:space="preserve"> definido), DB</w:t>
+              <w:t>IDE, Java (o stack definido), DB</w:t>
             </w:r>
           </w:p>
         </w:tc>
@@ -8043,7 +7023,6 @@
                 <w:lang w:eastAsia="es-CL"/>
               </w:rPr>
             </w:pPr>
-            <w:proofErr w:type="spellStart"/>
             <w:r>
               <w:rPr>
                 <w:rFonts w:ascii="Calibri" w:hAnsi="Calibri" w:cs="Arial"/>
@@ -8055,7 +7034,6 @@
               </w:rPr>
               <w:t>Yojan</w:t>
             </w:r>
-            <w:proofErr w:type="spellEnd"/>
           </w:p>
         </w:tc>
         <w:tc>
@@ -8074,29 +7052,16 @@
                 <w:lang w:eastAsia="es-CL"/>
               </w:rPr>
             </w:pPr>
-            <w:proofErr w:type="spellStart"/>
-            <w:r>
-              <w:rPr>
-                <w:rFonts w:ascii="Calibri" w:hAnsi="Calibri" w:cs="Arial"/>
-                <w:i/>
-                <w:color w:val="548DD4"/>
-                <w:sz w:val="18"/>
-                <w:szCs w:val="20"/>
-                <w:lang w:eastAsia="es-CL"/>
-              </w:rPr>
-              <w:t>Endpoints</w:t>
-            </w:r>
-            <w:proofErr w:type="spellEnd"/>
-            <w:r>
-              <w:rPr>
-                <w:rFonts w:ascii="Calibri" w:hAnsi="Calibri" w:cs="Arial"/>
-                <w:i/>
-                <w:color w:val="548DD4"/>
-                <w:sz w:val="18"/>
-                <w:szCs w:val="20"/>
-                <w:lang w:eastAsia="es-CL"/>
-              </w:rPr>
-              <w:t xml:space="preserve"> versionados y pruebas básicas.</w:t>
+            <w:r>
+              <w:rPr>
+                <w:rFonts w:ascii="Calibri" w:hAnsi="Calibri" w:cs="Arial"/>
+                <w:i/>
+                <w:color w:val="548DD4"/>
+                <w:sz w:val="18"/>
+                <w:szCs w:val="20"/>
+                <w:lang w:eastAsia="es-CL"/>
+              </w:rPr>
+              <w:t>Endpoints versionados y pruebas básicas.</w:t>
             </w:r>
           </w:p>
         </w:tc>
@@ -8130,55 +7095,7 @@
                 <w:szCs w:val="20"/>
                 <w:lang w:eastAsia="es-CL"/>
               </w:rPr>
-              <w:t>Full-</w:t>
-            </w:r>
-            <w:proofErr w:type="spellStart"/>
-            <w:r>
-              <w:rPr>
-                <w:rFonts w:ascii="Calibri" w:hAnsi="Calibri" w:cs="Arial"/>
-                <w:i/>
-                <w:color w:val="548DD4"/>
-                <w:sz w:val="18"/>
-                <w:szCs w:val="20"/>
-                <w:lang w:eastAsia="es-CL"/>
-              </w:rPr>
-              <w:t>Stack</w:t>
-            </w:r>
-            <w:proofErr w:type="spellEnd"/>
-            <w:r>
-              <w:rPr>
-                <w:rFonts w:ascii="Calibri" w:hAnsi="Calibri" w:cs="Arial"/>
-                <w:i/>
-                <w:color w:val="548DD4"/>
-                <w:sz w:val="18"/>
-                <w:szCs w:val="20"/>
-                <w:lang w:eastAsia="es-CL"/>
-              </w:rPr>
-              <w:t xml:space="preserve"> (</w:t>
-            </w:r>
-            <w:proofErr w:type="spellStart"/>
-            <w:r>
-              <w:rPr>
-                <w:rFonts w:ascii="Calibri" w:hAnsi="Calibri" w:cs="Arial"/>
-                <w:i/>
-                <w:color w:val="548DD4"/>
-                <w:sz w:val="18"/>
-                <w:szCs w:val="20"/>
-                <w:lang w:eastAsia="es-CL"/>
-              </w:rPr>
-              <w:t>backend+frontend</w:t>
-            </w:r>
-            <w:proofErr w:type="spellEnd"/>
-            <w:r>
-              <w:rPr>
-                <w:rFonts w:ascii="Calibri" w:hAnsi="Calibri" w:cs="Arial"/>
-                <w:i/>
-                <w:color w:val="548DD4"/>
-                <w:sz w:val="18"/>
-                <w:szCs w:val="20"/>
-                <w:lang w:eastAsia="es-CL"/>
-              </w:rPr>
-              <w:t>)</w:t>
+              <w:t>Full-Stack (backend+frontend)</w:t>
             </w:r>
           </w:p>
         </w:tc>
@@ -8265,45 +7182,8 @@
                 <w:szCs w:val="20"/>
                 <w:lang w:eastAsia="es-CL"/>
               </w:rPr>
-              <w:t xml:space="preserve">IDE, DB, </w:t>
-            </w:r>
-            <w:proofErr w:type="spellStart"/>
-            <w:r>
-              <w:rPr>
-                <w:rFonts w:ascii="Calibri" w:hAnsi="Calibri" w:cs="Arial"/>
-                <w:i/>
-                <w:color w:val="548DD4"/>
-                <w:sz w:val="18"/>
-                <w:szCs w:val="20"/>
-                <w:lang w:eastAsia="es-CL"/>
-              </w:rPr>
-              <w:t>Postman</w:t>
-            </w:r>
-            <w:proofErr w:type="spellEnd"/>
-            <w:r>
-              <w:rPr>
-                <w:rFonts w:ascii="Calibri" w:hAnsi="Calibri" w:cs="Arial"/>
-                <w:i/>
-                <w:color w:val="548DD4"/>
-                <w:sz w:val="18"/>
-                <w:szCs w:val="20"/>
-                <w:lang w:eastAsia="es-CL"/>
-              </w:rPr>
-              <w:t>/</w:t>
-            </w:r>
-            <w:proofErr w:type="spellStart"/>
-            <w:r>
-              <w:rPr>
-                <w:rFonts w:ascii="Calibri" w:hAnsi="Calibri" w:cs="Arial"/>
-                <w:i/>
-                <w:color w:val="548DD4"/>
-                <w:sz w:val="18"/>
-                <w:szCs w:val="20"/>
-                <w:lang w:eastAsia="es-CL"/>
-              </w:rPr>
-              <w:t>Insomnia</w:t>
-            </w:r>
-            <w:proofErr w:type="spellEnd"/>
+              <w:t>IDE, DB, Postman/Insomnia</w:t>
+            </w:r>
           </w:p>
         </w:tc>
         <w:tc>
@@ -8358,7 +7238,6 @@
                 <w:lang w:eastAsia="es-CL"/>
               </w:rPr>
             </w:pPr>
-            <w:proofErr w:type="spellStart"/>
             <w:r>
               <w:rPr>
                 <w:rFonts w:ascii="Calibri" w:hAnsi="Calibri" w:cs="Arial"/>
@@ -8370,7 +7249,6 @@
               </w:rPr>
               <w:t>Nestor</w:t>
             </w:r>
-            <w:proofErr w:type="spellEnd"/>
           </w:p>
         </w:tc>
         <w:tc>
@@ -8501,31 +7379,7 @@
                 <w:szCs w:val="20"/>
                 <w:lang w:eastAsia="es-CL"/>
               </w:rPr>
-              <w:t>Ingesta desde CSV/Excel/</w:t>
-            </w:r>
-            <w:proofErr w:type="spellStart"/>
-            <w:r>
-              <w:rPr>
-                <w:rFonts w:ascii="Calibri" w:hAnsi="Calibri" w:cs="Arial"/>
-                <w:i/>
-                <w:color w:val="548DD4"/>
-                <w:sz w:val="18"/>
-                <w:szCs w:val="20"/>
-                <w:lang w:eastAsia="es-CL"/>
-              </w:rPr>
-              <w:t>APIs</w:t>
-            </w:r>
-            <w:proofErr w:type="spellEnd"/>
-            <w:r>
-              <w:rPr>
-                <w:rFonts w:ascii="Calibri" w:hAnsi="Calibri" w:cs="Arial"/>
-                <w:i/>
-                <w:color w:val="548DD4"/>
-                <w:sz w:val="18"/>
-                <w:szCs w:val="20"/>
-                <w:lang w:eastAsia="es-CL"/>
-              </w:rPr>
-              <w:t xml:space="preserve">; reglas de completitud/consistencia; </w:t>
+              <w:t xml:space="preserve">Ingesta desde CSV/Excel/APIs; reglas de completitud/consistencia; </w:t>
             </w:r>
             <w:r>
               <w:rPr>
@@ -8667,31 +7521,7 @@
                 <w:szCs w:val="20"/>
                 <w:lang w:eastAsia="es-CL"/>
               </w:rPr>
-              <w:t xml:space="preserve"> (apoyo </w:t>
-            </w:r>
-            <w:proofErr w:type="spellStart"/>
-            <w:r>
-              <w:rPr>
-                <w:rFonts w:ascii="Calibri" w:hAnsi="Calibri" w:cs="Arial"/>
-                <w:i/>
-                <w:color w:val="548DD4"/>
-                <w:sz w:val="18"/>
-                <w:szCs w:val="20"/>
-                <w:lang w:eastAsia="es-CL"/>
-              </w:rPr>
-              <w:t>Yojan</w:t>
-            </w:r>
-            <w:proofErr w:type="spellEnd"/>
-            <w:r>
-              <w:rPr>
-                <w:rFonts w:ascii="Calibri" w:hAnsi="Calibri" w:cs="Arial"/>
-                <w:i/>
-                <w:color w:val="548DD4"/>
-                <w:sz w:val="18"/>
-                <w:szCs w:val="20"/>
-                <w:lang w:eastAsia="es-CL"/>
-              </w:rPr>
-              <w:t>)</w:t>
+              <w:t xml:space="preserve"> (apoyo Yojan)</w:t>
             </w:r>
           </w:p>
         </w:tc>
@@ -8720,31 +7550,7 @@
                 <w:szCs w:val="20"/>
                 <w:lang w:eastAsia="es-CL"/>
               </w:rPr>
-              <w:t xml:space="preserve">Sin datos íntegros no avanzan </w:t>
-            </w:r>
-            <w:proofErr w:type="spellStart"/>
-            <w:r>
-              <w:rPr>
-                <w:rFonts w:ascii="Calibri" w:hAnsi="Calibri" w:cs="Arial"/>
-                <w:i/>
-                <w:color w:val="548DD4"/>
-                <w:sz w:val="18"/>
-                <w:szCs w:val="20"/>
-                <w:lang w:eastAsia="es-CL"/>
-              </w:rPr>
-              <w:t>KPIs</w:t>
-            </w:r>
-            <w:proofErr w:type="spellEnd"/>
-            <w:r>
-              <w:rPr>
-                <w:rFonts w:ascii="Calibri" w:hAnsi="Calibri" w:cs="Arial"/>
-                <w:i/>
-                <w:color w:val="548DD4"/>
-                <w:sz w:val="18"/>
-                <w:szCs w:val="20"/>
-                <w:lang w:eastAsia="es-CL"/>
-              </w:rPr>
-              <w:t>/pronóstico.</w:t>
+              <w:t>Sin datos íntegros no avanzan KPIs/pronóstico.</w:t>
             </w:r>
           </w:p>
         </w:tc>
@@ -8798,43 +7604,17 @@
                 <w:lang w:eastAsia="es-CL"/>
               </w:rPr>
             </w:pPr>
-            <w:proofErr w:type="spellStart"/>
-            <w:r>
-              <w:rPr>
-                <w:rFonts w:ascii="Calibri" w:hAnsi="Calibri" w:cs="Arial"/>
-                <w:i/>
-                <w:color w:val="548DD4"/>
-                <w:sz w:val="18"/>
-                <w:szCs w:val="20"/>
-                <w:lang w:eastAsia="es-CL"/>
-              </w:rPr>
-              <w:t>Dashboard</w:t>
-            </w:r>
-            <w:proofErr w:type="spellEnd"/>
-            <w:r>
-              <w:rPr>
-                <w:rFonts w:ascii="Calibri" w:hAnsi="Calibri" w:cs="Arial"/>
-                <w:i/>
-                <w:color w:val="548DD4"/>
-                <w:sz w:val="18"/>
-                <w:szCs w:val="20"/>
-                <w:lang w:eastAsia="es-CL"/>
-              </w:rPr>
-              <w:t xml:space="preserve"> inicial + </w:t>
-            </w:r>
-            <w:proofErr w:type="spellStart"/>
-            <w:r>
-              <w:rPr>
-                <w:rFonts w:ascii="Calibri" w:hAnsi="Calibri" w:cs="Arial"/>
-                <w:i/>
-                <w:color w:val="548DD4"/>
-                <w:sz w:val="18"/>
-                <w:szCs w:val="20"/>
-                <w:lang w:eastAsia="es-CL"/>
-              </w:rPr>
-              <w:t>KPIs</w:t>
-            </w:r>
-            <w:proofErr w:type="spellEnd"/>
+            <w:r>
+              <w:rPr>
+                <w:rFonts w:ascii="Calibri" w:hAnsi="Calibri" w:cs="Arial"/>
+                <w:i/>
+                <w:color w:val="548DD4"/>
+                <w:sz w:val="18"/>
+                <w:szCs w:val="20"/>
+                <w:lang w:eastAsia="es-CL"/>
+              </w:rPr>
+              <w:t>Dashboard inicial + KPIs</w:t>
+            </w:r>
           </w:p>
         </w:tc>
         <w:tc>
@@ -8891,21 +7671,8 @@
                 <w:szCs w:val="20"/>
                 <w:lang w:eastAsia="es-CL"/>
               </w:rPr>
-              <w:t xml:space="preserve">DB, consultas, </w:t>
-            </w:r>
-            <w:proofErr w:type="spellStart"/>
-            <w:r>
-              <w:rPr>
-                <w:rFonts w:ascii="Calibri" w:hAnsi="Calibri" w:cs="Arial"/>
-                <w:i/>
-                <w:color w:val="548DD4"/>
-                <w:sz w:val="18"/>
-                <w:szCs w:val="20"/>
-                <w:lang w:eastAsia="es-CL"/>
-              </w:rPr>
-              <w:t>Frontend</w:t>
-            </w:r>
-            <w:proofErr w:type="spellEnd"/>
+              <w:t>DB, consultas, Frontend</w:t>
+            </w:r>
           </w:p>
         </w:tc>
         <w:tc>
@@ -8960,7 +7727,6 @@
                 <w:lang w:eastAsia="es-CL"/>
               </w:rPr>
             </w:pPr>
-            <w:proofErr w:type="spellStart"/>
             <w:r>
               <w:rPr>
                 <w:rFonts w:ascii="Calibri" w:hAnsi="Calibri" w:cs="Arial"/>
@@ -8972,7 +7738,6 @@
               </w:rPr>
               <w:t>Nestor</w:t>
             </w:r>
-            <w:proofErr w:type="spellEnd"/>
           </w:p>
         </w:tc>
         <w:tc>
@@ -9063,21 +7828,8 @@
                 <w:szCs w:val="20"/>
                 <w:lang w:eastAsia="es-CL"/>
               </w:rPr>
-              <w:t xml:space="preserve">Piloto y </w:t>
-            </w:r>
-            <w:proofErr w:type="spellStart"/>
-            <w:r>
-              <w:rPr>
-                <w:rFonts w:ascii="Calibri" w:hAnsi="Calibri" w:cs="Arial"/>
-                <w:i/>
-                <w:color w:val="548DD4"/>
-                <w:sz w:val="18"/>
-                <w:szCs w:val="20"/>
-                <w:lang w:eastAsia="es-CL"/>
-              </w:rPr>
-              <w:t>feedback</w:t>
-            </w:r>
-            <w:proofErr w:type="spellEnd"/>
+              <w:t>Piloto y feedback</w:t>
+            </w:r>
           </w:p>
         </w:tc>
         <w:tc>
@@ -9538,7 +8290,6 @@
                 <w:lang w:eastAsia="es-CL"/>
               </w:rPr>
             </w:pPr>
-            <w:proofErr w:type="spellStart"/>
             <w:r>
               <w:rPr>
                 <w:rFonts w:ascii="Calibri" w:hAnsi="Calibri" w:cs="Arial"/>
@@ -9552,7 +8303,6 @@
               </w:rPr>
               <w:t>Yojan</w:t>
             </w:r>
-            <w:proofErr w:type="spellEnd"/>
             <w:r>
               <w:rPr>
                 <w:rFonts w:ascii="Calibri" w:hAnsi="Calibri" w:cs="Arial"/>
@@ -9684,31 +8434,7 @@
                       <w:szCs w:val="20"/>
                       <w:lang w:eastAsia="es-CL"/>
                     </w:rPr>
-                    <w:t xml:space="preserve">Cerrar </w:t>
-                  </w:r>
-                  <w:proofErr w:type="spellStart"/>
-                  <w:r>
-                    <w:rPr>
-                      <w:rFonts w:ascii="Calibri" w:hAnsi="Calibri" w:cs="Arial"/>
-                      <w:i/>
-                      <w:color w:val="548DD4"/>
-                      <w:sz w:val="18"/>
-                      <w:szCs w:val="20"/>
-                      <w:lang w:eastAsia="es-CL"/>
-                    </w:rPr>
-                    <w:t>issues</w:t>
-                  </w:r>
-                  <w:proofErr w:type="spellEnd"/>
-                  <w:r>
-                    <w:rPr>
-                      <w:rFonts w:ascii="Calibri" w:hAnsi="Calibri" w:cs="Arial"/>
-                      <w:i/>
-                      <w:color w:val="548DD4"/>
-                      <w:sz w:val="18"/>
-                      <w:szCs w:val="20"/>
-                      <w:lang w:eastAsia="es-CL"/>
-                    </w:rPr>
-                    <w:t xml:space="preserve"> críticos</w:t>
+                    <w:t>Cerrar issues críticos</w:t>
                   </w:r>
                 </w:p>
                 <w:p>
@@ -9861,29 +8587,16 @@
                 <w:lang w:eastAsia="es-CL"/>
               </w:rPr>
             </w:pPr>
-            <w:proofErr w:type="spellStart"/>
-            <w:r>
-              <w:rPr>
-                <w:rFonts w:ascii="Calibri" w:hAnsi="Calibri" w:cs="Arial"/>
-                <w:i/>
-                <w:color w:val="548DD4"/>
-                <w:sz w:val="18"/>
-                <w:szCs w:val="20"/>
-                <w:lang w:eastAsia="es-CL"/>
-              </w:rPr>
-              <w:t>Docs</w:t>
-            </w:r>
-            <w:proofErr w:type="spellEnd"/>
-            <w:r>
-              <w:rPr>
-                <w:rFonts w:ascii="Calibri" w:hAnsi="Calibri" w:cs="Arial"/>
-                <w:i/>
-                <w:color w:val="548DD4"/>
-                <w:sz w:val="18"/>
-                <w:szCs w:val="20"/>
-                <w:lang w:eastAsia="es-CL"/>
-              </w:rPr>
-              <w:t>, PPT</w:t>
+            <w:r>
+              <w:rPr>
+                <w:rFonts w:ascii="Calibri" w:hAnsi="Calibri" w:cs="Arial"/>
+                <w:i/>
+                <w:color w:val="548DD4"/>
+                <w:sz w:val="18"/>
+                <w:szCs w:val="20"/>
+                <w:lang w:eastAsia="es-CL"/>
+              </w:rPr>
+              <w:t>Docs, PPT</w:t>
             </w:r>
           </w:p>
         </w:tc>
@@ -10327,23 +9040,23 @@
                 <w:rFonts w:ascii="Calibri" w:hAnsi="Calibri"/>
                 <w:color w:val="1F3864" w:themeColor="accent1" w:themeShade="80"/>
               </w:rPr>
-              <w:t xml:space="preserve">con definición de idea, arquitectura/modelo de datos, mockups y </w:t>
-            </w:r>
-            <w:proofErr w:type="spellStart"/>
+              <w:t xml:space="preserve">con definición de idea, arquitectura/modelo de datos, mockups y setup de repositorios y CI/CD; </w:t>
+            </w:r>
             <w:r>
               <w:rPr>
                 <w:rFonts w:ascii="Calibri" w:hAnsi="Calibri"/>
-                <w:color w:val="1F3864" w:themeColor="accent1" w:themeShade="80"/>
-              </w:rPr>
-              <w:t>setup</w:t>
-            </w:r>
-            <w:proofErr w:type="spellEnd"/>
+                <w:b/>
+                <w:bCs/>
+                <w:color w:val="1F3864" w:themeColor="accent1" w:themeShade="80"/>
+              </w:rPr>
+              <w:t xml:space="preserve">Fase 2 </w:t>
+            </w:r>
             <w:r>
               <w:rPr>
                 <w:rFonts w:ascii="Calibri" w:hAnsi="Calibri"/>
                 <w:color w:val="1F3864" w:themeColor="accent1" w:themeShade="80"/>
               </w:rPr>
-              <w:t xml:space="preserve"> de repositorios y CI/CD; </w:t>
+              <w:t xml:space="preserve">con desarrollo incremental por sprints (BD conectada, backend CRUD de productos y frontend login+listado; luego dashboard con reportes y alertas; después procesamiento batch a cloud storage y módulo de predicción; y finalmente estabilización); y </w:t>
             </w:r>
             <w:r>
               <w:rPr>
@@ -10352,190 +9065,14 @@
                 <w:bCs/>
                 <w:color w:val="1F3864" w:themeColor="accent1" w:themeShade="80"/>
               </w:rPr>
-              <w:t xml:space="preserve">Fase 2 </w:t>
+              <w:t xml:space="preserve">Fase 3 </w:t>
             </w:r>
             <w:r>
               <w:rPr>
                 <w:rFonts w:ascii="Calibri" w:hAnsi="Calibri"/>
                 <w:color w:val="1F3864" w:themeColor="accent1" w:themeShade="80"/>
               </w:rPr>
-              <w:t xml:space="preserve">con desarrollo incremental por </w:t>
-            </w:r>
-            <w:proofErr w:type="spellStart"/>
-            <w:r>
-              <w:rPr>
-                <w:rFonts w:ascii="Calibri" w:hAnsi="Calibri"/>
-                <w:color w:val="1F3864" w:themeColor="accent1" w:themeShade="80"/>
-              </w:rPr>
-              <w:t>sprints</w:t>
-            </w:r>
-            <w:proofErr w:type="spellEnd"/>
-            <w:r>
-              <w:rPr>
-                <w:rFonts w:ascii="Calibri" w:hAnsi="Calibri"/>
-                <w:color w:val="1F3864" w:themeColor="accent1" w:themeShade="80"/>
-              </w:rPr>
-              <w:t xml:space="preserve"> (</w:t>
-            </w:r>
-            <w:proofErr w:type="gramStart"/>
-            <w:r>
-              <w:rPr>
-                <w:rFonts w:ascii="Calibri" w:hAnsi="Calibri"/>
-                <w:color w:val="1F3864" w:themeColor="accent1" w:themeShade="80"/>
-              </w:rPr>
-              <w:t>BD conectada</w:t>
-            </w:r>
-            <w:proofErr w:type="gramEnd"/>
-            <w:r>
-              <w:rPr>
-                <w:rFonts w:ascii="Calibri" w:hAnsi="Calibri"/>
-                <w:color w:val="1F3864" w:themeColor="accent1" w:themeShade="80"/>
-              </w:rPr>
-              <w:t xml:space="preserve">, </w:t>
-            </w:r>
-            <w:proofErr w:type="spellStart"/>
-            <w:r>
-              <w:rPr>
-                <w:rFonts w:ascii="Calibri" w:hAnsi="Calibri"/>
-                <w:color w:val="1F3864" w:themeColor="accent1" w:themeShade="80"/>
-              </w:rPr>
-              <w:t>backend</w:t>
-            </w:r>
-            <w:proofErr w:type="spellEnd"/>
-            <w:r>
-              <w:rPr>
-                <w:rFonts w:ascii="Calibri" w:hAnsi="Calibri"/>
-                <w:color w:val="1F3864" w:themeColor="accent1" w:themeShade="80"/>
-              </w:rPr>
-              <w:t xml:space="preserve"> CRUD de productos y </w:t>
-            </w:r>
-            <w:proofErr w:type="spellStart"/>
-            <w:r>
-              <w:rPr>
-                <w:rFonts w:ascii="Calibri" w:hAnsi="Calibri"/>
-                <w:color w:val="1F3864" w:themeColor="accent1" w:themeShade="80"/>
-              </w:rPr>
-              <w:t>frontend</w:t>
-            </w:r>
-            <w:proofErr w:type="spellEnd"/>
-            <w:r>
-              <w:rPr>
-                <w:rFonts w:ascii="Calibri" w:hAnsi="Calibri"/>
-                <w:color w:val="1F3864" w:themeColor="accent1" w:themeShade="80"/>
-              </w:rPr>
-              <w:t xml:space="preserve"> </w:t>
-            </w:r>
-            <w:proofErr w:type="spellStart"/>
-            <w:r>
-              <w:rPr>
-                <w:rFonts w:ascii="Calibri" w:hAnsi="Calibri"/>
-                <w:color w:val="1F3864" w:themeColor="accent1" w:themeShade="80"/>
-              </w:rPr>
-              <w:t>login+listado</w:t>
-            </w:r>
-            <w:proofErr w:type="spellEnd"/>
-            <w:r>
-              <w:rPr>
-                <w:rFonts w:ascii="Calibri" w:hAnsi="Calibri"/>
-                <w:color w:val="1F3864" w:themeColor="accent1" w:themeShade="80"/>
-              </w:rPr>
-              <w:t xml:space="preserve">; luego </w:t>
-            </w:r>
-            <w:proofErr w:type="spellStart"/>
-            <w:r>
-              <w:rPr>
-                <w:rFonts w:ascii="Calibri" w:hAnsi="Calibri"/>
-                <w:color w:val="1F3864" w:themeColor="accent1" w:themeShade="80"/>
-              </w:rPr>
-              <w:t>dashboard</w:t>
-            </w:r>
-            <w:proofErr w:type="spellEnd"/>
-            <w:r>
-              <w:rPr>
-                <w:rFonts w:ascii="Calibri" w:hAnsi="Calibri"/>
-                <w:color w:val="1F3864" w:themeColor="accent1" w:themeShade="80"/>
-              </w:rPr>
-              <w:t xml:space="preserve"> con reportes y alertas; después procesamiento </w:t>
-            </w:r>
-            <w:proofErr w:type="spellStart"/>
-            <w:r>
-              <w:rPr>
-                <w:rFonts w:ascii="Calibri" w:hAnsi="Calibri"/>
-                <w:color w:val="1F3864" w:themeColor="accent1" w:themeShade="80"/>
-              </w:rPr>
-              <w:t>batch</w:t>
-            </w:r>
-            <w:proofErr w:type="spellEnd"/>
-            <w:r>
-              <w:rPr>
-                <w:rFonts w:ascii="Calibri" w:hAnsi="Calibri"/>
-                <w:color w:val="1F3864" w:themeColor="accent1" w:themeShade="80"/>
-              </w:rPr>
-              <w:t xml:space="preserve"> a </w:t>
-            </w:r>
-            <w:proofErr w:type="spellStart"/>
-            <w:r>
-              <w:rPr>
-                <w:rFonts w:ascii="Calibri" w:hAnsi="Calibri"/>
-                <w:color w:val="1F3864" w:themeColor="accent1" w:themeShade="80"/>
-              </w:rPr>
-              <w:t>cloud</w:t>
-            </w:r>
-            <w:proofErr w:type="spellEnd"/>
-            <w:r>
-              <w:rPr>
-                <w:rFonts w:ascii="Calibri" w:hAnsi="Calibri"/>
-                <w:color w:val="1F3864" w:themeColor="accent1" w:themeShade="80"/>
-              </w:rPr>
-              <w:t xml:space="preserve"> </w:t>
-            </w:r>
-            <w:proofErr w:type="spellStart"/>
-            <w:r>
-              <w:rPr>
-                <w:rFonts w:ascii="Calibri" w:hAnsi="Calibri"/>
-                <w:color w:val="1F3864" w:themeColor="accent1" w:themeShade="80"/>
-              </w:rPr>
-              <w:t>storage</w:t>
-            </w:r>
-            <w:proofErr w:type="spellEnd"/>
-            <w:r>
-              <w:rPr>
-                <w:rFonts w:ascii="Calibri" w:hAnsi="Calibri"/>
-                <w:color w:val="1F3864" w:themeColor="accent1" w:themeShade="80"/>
-              </w:rPr>
-              <w:t xml:space="preserve"> y módulo de predicción; y finalmente estabilización); y </w:t>
-            </w:r>
-            <w:r>
-              <w:rPr>
-                <w:rFonts w:ascii="Calibri" w:hAnsi="Calibri"/>
-                <w:b/>
-                <w:bCs/>
-                <w:color w:val="1F3864" w:themeColor="accent1" w:themeShade="80"/>
-              </w:rPr>
-              <w:t xml:space="preserve">Fase 3 </w:t>
-            </w:r>
-            <w:r>
-              <w:rPr>
-                <w:rFonts w:ascii="Calibri" w:hAnsi="Calibri"/>
-                <w:color w:val="1F3864" w:themeColor="accent1" w:themeShade="80"/>
-              </w:rPr>
-              <w:t>con documentación, presentación final y cierre. Cada sprint termina con demo y evidencias en el repositorio, con responsables asignados (PM, Líder/Arquitectura &amp; Datos y dos desarrolladores full-</w:t>
-            </w:r>
-            <w:proofErr w:type="spellStart"/>
-            <w:r>
-              <w:rPr>
-                <w:rFonts w:ascii="Calibri" w:hAnsi="Calibri"/>
-                <w:color w:val="1F3864" w:themeColor="accent1" w:themeShade="80"/>
-              </w:rPr>
-              <w:t>stack</w:t>
-            </w:r>
-            <w:proofErr w:type="spellEnd"/>
-            <w:r>
-              <w:rPr>
-                <w:rFonts w:ascii="Calibri" w:hAnsi="Calibri"/>
-                <w:color w:val="1F3864" w:themeColor="accent1" w:themeShade="80"/>
-              </w:rPr>
-              <w:t>) y dependencias claras para asegurar avance medible.</w:t>
+              <w:t>con documentación, presentación final y cierre. Cada sprint termina con demo y evidencias en el repositorio, con responsables asignados (PM, Líder/Arquitectura &amp; Datos y dos desarrolladores full-stack) y dependencias claras para asegurar avance medible.</w:t>
             </w:r>
           </w:p>
         </w:tc>
@@ -14227,6 +12764,12 @@
 </file>
 
 <file path=customXml/item1.xml><?xml version="1.0" encoding="utf-8"?>
+<p:properties xmlns:p="http://schemas.microsoft.com/office/2006/metadata/properties" xmlns:xsi="http://www.w3.org/2001/XMLSchema-instance" xmlns:pc="http://schemas.microsoft.com/office/infopath/2007/PartnerControls">
+  <documentManagement/>
+</p:properties>
+</file>
+
+<file path=customXml/item2.xml><?xml version="1.0" encoding="utf-8"?>
 <ct:contentTypeSchema xmlns:ct="http://schemas.microsoft.com/office/2006/metadata/contentType" xmlns:ma="http://schemas.microsoft.com/office/2006/metadata/properties/metaAttributes" ct:_="" ma:_="" ma:contentTypeName="Documento" ma:contentTypeID="0x010100E96778489EE7714D8BD12CC105EB918B" ma:contentTypeVersion="2" ma:contentTypeDescription="Crear nuevo documento." ma:contentTypeScope="" ma:versionID="416c5c7ae9b5d54d83875cd3c65194e3">
   <xsd:schema xmlns:xsd="http://www.w3.org/2001/XMLSchema" xmlns:xs="http://www.w3.org/2001/XMLSchema" xmlns:p="http://schemas.microsoft.com/office/2006/metadata/properties" xmlns:ns2="126e8a1c-9ea9-435a-ac89-d06c80d62e30" targetNamespace="http://schemas.microsoft.com/office/2006/metadata/properties" ma:root="true" ma:fieldsID="70a237c842677bd850644f8595079f5e" ns2:_="">
     <xsd:import namespace="126e8a1c-9ea9-435a-ac89-d06c80d62e30"/>
@@ -14358,12 +12901,6 @@
 </ct:contentTypeSchema>
 </file>
 
-<file path=customXml/item2.xml><?xml version="1.0" encoding="utf-8"?>
-<p:properties xmlns:p="http://schemas.microsoft.com/office/2006/metadata/properties" xmlns:xsi="http://www.w3.org/2001/XMLSchema-instance" xmlns:pc="http://schemas.microsoft.com/office/infopath/2007/PartnerControls">
-  <documentManagement/>
-</p:properties>
-</file>
-
 <file path=customXml/item3.xml><?xml version="1.0" encoding="utf-8"?>
 <?mso-contentType ?>
 <FormTemplates xmlns="http://schemas.microsoft.com/sharepoint/v3/contenttype/forms">
@@ -14374,6 +12911,15 @@
 </file>
 
 <file path=customXml/itemProps1.xml><?xml version="1.0" encoding="utf-8"?>
+<ds:datastoreItem xmlns:ds="http://schemas.openxmlformats.org/officeDocument/2006/customXml" ds:itemID="{38174882-579A-45DC-A704-C035A9357F73}">
+  <ds:schemaRefs>
+    <ds:schemaRef ds:uri="http://schemas.microsoft.com/office/2006/metadata/properties"/>
+    <ds:schemaRef ds:uri="http://schemas.microsoft.com/office/infopath/2007/PartnerControls"/>
+  </ds:schemaRefs>
+</ds:datastoreItem>
+</file>
+
+<file path=customXml/itemProps2.xml><?xml version="1.0" encoding="utf-8"?>
 <ds:datastoreItem xmlns:ds="http://schemas.openxmlformats.org/officeDocument/2006/customXml" ds:itemID="{7C9B9CFF-B258-43B4-948A-968A031773F5}">
   <ds:schemaRefs>
     <ds:schemaRef ds:uri="http://schemas.microsoft.com/office/2006/metadata/contentType"/>
@@ -14391,15 +12937,6 @@
 </ds:datastoreItem>
 </file>
 
-<file path=customXml/itemProps2.xml><?xml version="1.0" encoding="utf-8"?>
-<ds:datastoreItem xmlns:ds="http://schemas.openxmlformats.org/officeDocument/2006/customXml" ds:itemID="{38174882-579A-45DC-A704-C035A9357F73}">
-  <ds:schemaRefs>
-    <ds:schemaRef ds:uri="http://schemas.microsoft.com/office/2006/metadata/properties"/>
-    <ds:schemaRef ds:uri="http://schemas.microsoft.com/office/infopath/2007/PartnerControls"/>
-  </ds:schemaRefs>
-</ds:datastoreItem>
-</file>
-
 <file path=customXml/itemProps3.xml><?xml version="1.0" encoding="utf-8"?>
 <ds:datastoreItem xmlns:ds="http://schemas.openxmlformats.org/officeDocument/2006/customXml" ds:itemID="{F3E3E2F7-59E7-4722-B872-D023DC9D1CC1}">
   <ds:schemaRefs>

</xml_diff>